<commit_message>
Publish V0.3 runtime validation, full events and updated manuscript
Add repeated board and fault-recovery evidence, complete long-trial event audits, measured 100-Mbps validation, separately pinned bitstreams, and bilingual release notes. Preserve unresolved gigabit observations and defer further 1-Gbps tests.
</commit_message>
<xml_diff>
--- a/code/Paper/manuscript_full_v2.docx
+++ b/code/Paper/manuscript_full_v2.docx
@@ -12,7 +12,7 @@
     </w:p>
     <w:p>
       <w:r>
-        <w:t>Research manuscript, revised 28 September 2026</w:t>
+        <w:t>Research manuscript, V0.3, revised 2 October 2026</w:t>
       </w:r>
     </w:p>
     <w:p>
@@ -25,7 +25,12 @@
     </w:p>
     <w:p>
       <w:r>
-        <w:t>The MaleCNS connectome provides neuron-resolved structural data for the adult male Drosophila central nervous system, but its synapse table is not itself an executable circuit. We built CNS2FPGA to extract path-constrained subgraphs, compile signed weighted connectivity into reproducible memory images, and execute a discrete-time leaky integrate-and-fire (LIF) model on a time-multiplexed FPGA. The central deployment result is a single AXKU115 bitstream that accepts different neural-network images over UDP without FPGA resynthesis or reprogramming. On that bitstream, a 226-neuron/1,730-edge visual image and then a 6,279-neuron/350,185-edge courtship image passed commit and status checks; the latter passed an eight-step board trial with all 2,475 ordered spike events matching fixed-point CPU and zero missed steps. Against the earlier dedicated courtship bitstream under the same eight-step input, its complete ordered event file and seven non-latency summary words per step were unchanged, but the slowest core step increased from 199,063 to 199,699 cycles and routed LUT use from 11,912 to 32,422. Both met the 200,000-cycle deadline. The upload link negotiated 100 Mbps in this run; host-inclusive throughput was not benchmarked. Earlier dedicated/JTAG implementations separately established courtship population-count agreement in 13 stimulus conditions and visual agreement for 560 ordered events in a 250-ms trial. Five-seed perturbations and a four-format width sweep delimit numerical behavior. These measurements establish runtime image interchange and fidelity of specified connectome-constrained computations, not agreement with neural recordings or fly behavior.</w:t>
+        <w:t>The MaleCNS connectome provides neuron-resolved structural data for the adult male Drosophila central nervous system, but its synapse table is not itself an executable circuit. We built CNS2FPGA to extract path-constrained subgraphs, compile signed weighted connectivity into reproducible memory images, and execute a discrete-time leaky integrate-and-fire (LIF) model on a time-multiplexed FPGA. Its central deployment result is an AXKU115 runtime bitstream that accepts different neural-network images over UDP without FPGA resynthesis or reprogramming between images. In each of two independently programmed sessions, a 226-neuron/1,730-edge visual image produced all 560 expected ordered events in a 250-step trial, followed by a 6,279-neuron/350,185-edge courtship image producing all 2,475 expected ordered events in an eight-step trial. Three 4,308-step courtship conditions per session matched fixed-point CPU response-window population counts and the earlier dedicated FPGA's 34,464 per-step non-cycle fields per condition. A separately built 131,072-event-capacity runtime bitstream then captured all 40,868, 74,765, and 99,349 ordered individual events in those three long conditions; every event matched an independent fixed-point CPU reference in one successful board campaign. Both original-runtime sessions rejected incomplete and invalid uploads and recovered with a valid visual image; no deadline miss or diagnostic fault was observed. The worst courtship step was 199,699 of 200,000 available cycles. Host-inclusive image uploads took 0.135–0.173 s for visual and 1.360–1.848 s for courtship in the original-runtime campaign; a host readout showed a 1-Gbps link, without establishing line-rate throughput. The expanded-event image initially received no UDP ACK after programming and succeeded after the same bitstream was reprogrammed; these observations are reported separately. A JTAG runtime bitstream also passed physical two-image switching and fault recovery. Relative to the older dedicated courtship bitstream, the original Ethernet runtime bitstream preserved tested neural outputs but increased the worst core step by 636 cycles and routed LUT use from 11,912 to 32,422. These are engineering-output tests, not agreement with neural recordings or fly behavior.</w:t>
+      </w:r>
+    </w:p>
+    <w:p>
+      <w:r>
+        <w:t>An additional session on the same expanded-event bitstream at a measured 100 Mbps passed 20/20 STATUS probes, a complete courtship image upload, and 2,475 exact ordered events over eight steps with zero bad FCS. Subsequent 1-Gbps receive failures remain unresolved; further gigabit testing is deferred pending cable and link checks.</w:t>
       </w:r>
     </w:p>
     <w:p>
@@ -105,17 +110,17 @@
     </w:p>
     <w:p>
       <w:r>
-        <w:t>The FPGA engine evaluates virtual neurons sequentially from on-chip memories and accumulates contributions from the preceding timestep's spikes. The board trial interface loads one signed 34-bit scalar input-current word per model step over JTAG AXI-Lite. Input-anchor flags determine which cells receive that word. The host reads summary counters, diagnostic flags, and, when event memory permits, ordered spike records. The large courtship trials export per-step group counts; the short courtship raster and the visual left-input trial export full event sequences. A JTAG host transfer is outside the measured neural-core timestep latency.</w:t>
+        <w:t>The FPGA engine evaluates virtual neurons sequentially from on-chip memories and accumulates contributions from the preceding timestep's spikes. The board trial interface loads one signed 34-bit scalar input-current word per model step over JTAG AXI-Lite. Input-anchor flags determine which cells receive that word. The host reads summary counters, diagnostic flags, and ordered spike records when event memory permits. The original 65,536-event runtime image exported per-step group counts but not the full 74,765- and 99,349-event courtship trials. A separately built version increased event BRAM capacity to 131,072 entries; its three selected long trials, the short courtship raster, and the visual left-input trial have complete event readbacks in their respective tests. A JTAG host transfer is outside the measured neural-core timestep latency.</w:t>
       </w:r>
     </w:p>
     <w:p>
       <w:r>
-        <w:t>The runtime version retains this engine and adds a UDP/IPv4 loader over the AXKU115 RGMII port. A host preflights a compiled image, sends ordered 32-bit word blocks (at most 64 words per datagram), requests COMMIT, and then checks STATUS independently. The loader uses sequence numbers and ACKs to reject out-of-order or repeated writes; non-target UDP packets are drained without replies. The runtime bitstream was programmed once for the reported visual-to-courtship sequence. The visual wrapper's first additional STATUS request used an incorrect sequence number and failed, but a corrected independent probe established image status 1 before courtship was uploaded. The courtship COMMIT and independent STATUS both passed. JTAG and UDP were not used concurrently. The host-side transfer and JTAG control times are excluded from core-step latency.</w:t>
+        <w:t>The runtime version retains this engine and adds a UDP/IPv4 loader over the AXKU115 RGMII port. A host preflights a compiled image, sends ordered 32-bit word blocks (at most 64 words per datagram), requests COMMIT, and then checks STATUS independently. The loader uses sequence numbers and ACKs to reject out-of-order or repeated writes; non-target UDP packets are drained without replies. The initial September 28 demonstration programmed this bitstream once for a visual-to-courtship sequence. Its visual wrapper's extra STATUS request used an incorrect sequence number and failed, but a corrected independent probe established image status 1 before courtship was uploaded. For the September 30 P0 campaign, we programmed the same SHA-256-pinned bitstream once in each of two separate sessions. In each session we loaded the visual image, ran 250 steps with full event capture, loaded courtship without reprogramming, ran an eight-step full-event test and 15-, 35-, and 65-ms IPI long trials, then tested interrupted and malformed uploads and recovery by reloading visual. We separately exercised the JTAG runtime bitstream with one programming operation, two image loads, and transport/invalid-image rejection. JTAG and UDP image transfers were never concurrent. Stopwatch upload durations include host software and UDP protocol, whereas JTAG control and host transfer are excluded from the reported neural-core step latency.</w:t>
       </w:r>
     </w:p>
     <w:p>
       <w:r>
-        <w:t>For a paired implementation comparison, we used the same frozen eight-step courtship smoke8 stimulus and 200-MHz clock with the earlier dedicated courtship bitstream and the later Ethernet runtime bitstream. We compared each step's eight raw summary words by position, the complete ordered event-word files byte for byte, and the separate routed utilization and timing reports. Cycle count is summary word 0; an equal output event stream does not imply equal execution cycles, physical resources, or general equivalence under untested stimuli. The paired comparison has one recorded short trial per implementation and does not isolate which internal hardware stage caused a cycle difference.</w:t>
+        <w:t>For a paired implementation comparison, we used the same frozen eight-step courtship smoke8 stimulus and 200-MHz clock with the earlier dedicated courtship bitstream and the original Ethernet runtime bitstream. We compared each step's eight raw summary words by position, the complete ordered event-word files byte for byte, and the separate routed utilization and timing reports. Cycle count is summary word 0; an equal output event stream does not imply equal execution cycles, physical resources, or general equivalence under untested stimuli. The original paired comparison had one recorded short trial per implementation; the Ethernet side was subsequently repeated in the two P0 sessions. Each long P0 trial additionally compared response-window vPN1, pC1, pIP10, and pMP2 totals with fixed CPU and eight non-cycle parsed fields at each of 4,308 steps with the older dedicated-board capture. Those original P0 long trials did not record individual events. For the expanded-event bitstream, an independently generated fixed-point CPU event reference was compared with every ordered (timestep, neuron ID) pair, event start offset, per-step event count, seven other output/synapse fields, and fault/deadline flags in each long trial. Internal per-neuron voltage, current, and refractory states were not read back from either board image.</w:t>
       </w:r>
     </w:p>
     <w:p>
@@ -174,7 +179,7 @@
     </w:p>
     <w:p>
       <w:r>
-        <w:t>The source tables, selection configurations, intermediate graphs, memory images, CPU traces, board captures, Vivado timing/utilization reports, and protocol-lock hashes are retained in the project workspace. Table values and plotted coordinates in this paper are copied from the machine-readable files listed in the accompanying data manifest. No external power meter, independent board replication, or experimental fly response dataset was used for the claims below.</w:t>
+        <w:t>The source tables, selection configurations, intermediate graphs, memory images, CPU traces, board captures, Vivado timing/utilization reports, and protocol-lock hashes are retained in the project workspace. Table values and plotted coordinates in this paper are copied from the machine-readable files listed in the accompanying data manifest. The P0 audit re-runs the frozen trial validators on raw captures and compares the two original-runtime session files and bitstream hashes. A separate audit independently rechecks all 214,982 long-trial events captured on the expanded-event bitstream against fixed CPU and preserves the first-program Ethernet timeout as a failed attempt. The two original-runtime sessions and the one successful expanded-event campaign used the same physical board, not independent laboratories or boards. No external power meter or experimental fly response dataset was used for the claims below.</w:t>
       </w:r>
     </w:p>
     <w:p>
@@ -902,7 +907,7 @@
     </w:p>
     <w:p>
       <w:r>
-        <w:t>All 13 courtship conditions matched between floating and fixed CPU at the ordered individual-event level. On the board, all measured per-timestep population counts matched fixed CPU in the long conditions; the eight-pulse raster additionally matched ordered individual events. The 40-pulse pC1 response-window count rose from 611 at 15 ms IPI to 2,326 at 65 ms and then was 2,238 at 95 ms (Table 2, Figure 2). These are model spike counts under differently timed windows, not a fit to the pC1 calcium or behavioral tuning curve in [3]. The Figure 2 y-axis divides each count by 40 pulses to show the event-normalized response without implying a measured neural firing rate.</w:t>
+        <w:t>All 13 courtship conditions matched between floating and fixed CPU at the ordered individual-event level. On the board, all measured per-timestep population counts matched fixed CPU in the long conditions; the eight-pulse raster additionally matched ordered individual events. A later expanded-event board image also matched every ordered individual event in the 15-, 35-, and 65-ms IPI long conditions (Figure 9), but not the other long conditions. The 40-pulse pC1 response-window count rose from 611 at 15 ms IPI to 2,326 at 65 ms and then was 2,238 at 95 ms (Table 2, Figure 2). These are model spike counts under differently timed windows, not a fit to the pC1 calcium or behavioral tuning curve in [3]. The Figure 2 y-axis divides each count by 40 pulses to show the event-normalized response without implying a measured neural firing rate.</w:t>
       </w:r>
     </w:p>
     <w:p>
@@ -2727,7 +2732,7 @@
         <w:pStyle w:val="PaperCaption"/>
       </w:pPr>
       <w:r>
-        <w:t>Figure 3. Full individual-event raster for the 350-ms, eight-pulse courtship trial. CPU float, CPU fixed, and FPGA output agree on the ordered event sequence. The long courtship trials were not read out as complete individual-event rasters because event capture memory was limited; they were verified through per-step group counts.</w:t>
+        <w:t>Figure 3. Full individual-event raster for the 350-ms, eight-pulse courtship trial. CPU float, CPU fixed, and FPGA output agree on the ordered event sequence. The original runtime P0 long trials were verified through per-step group counts because their event capture was disabled; a separate expanded-event bitstream later captured three complete long sequences (Figure 9).</w:t>
       </w:r>
     </w:p>
     <w:p>
@@ -5451,7 +5456,7 @@
     </w:p>
     <w:p>
       <w:r>
-        <w:t>The earlier left-input image was placed and routed as a separate KU115 bitstream, because the scalar board input broadcasts to all cells flagged as input anchors. The image retains both DNa02 cells and the same synapse graph. Its 200-MHz implementation passed setup and hold timing (+0.191 and +0.028 ns), with zero unrouted or partially routed nets and zero DRC errors. In the 250-step 40-ms-IPI trial, all 560 ordered individual spike events and all 250 total-spike step counts matched fixed CPU. The observed DNa02_L/DNa02_R counts were 5/0. Maximum core latency was 4,439 cycles (22.195 µs), with zero deadline misses, saturation diagnostics, or event overflow. Physical resources are in Table 3. This 250-step trial was not repeated after Ethernet runtime loading; the difference in maximum measured cycles between the earlier circuits reflects both graph size and workload, not a controlled scaling law.</w:t>
+        <w:t>The earlier left-input image was placed and routed as a separate KU115 bitstream, because the scalar board input broadcasts to all cells flagged as input anchors. The image retains both DNa02 cells and the same synapse graph. Its 200-MHz implementation passed setup and hold timing (+0.191 and +0.028 ns), with zero unrouted or partially routed nets and zero DRC errors. In the 250-step 40-ms-IPI trial, all 560 ordered individual spike events and all 250 total-spike step counts matched fixed CPU. The observed DNa02_L/DNa02_R counts were 5/0. Maximum core latency was 4,439 cycles (22.195 µs), with zero deadline misses, saturation diagnostics, or event overflow. Physical resources are in Table 3. This trial was later repeated on the Ethernet runtime bitstream in the P0 campaign (Figure 8); its 4,548-cycle maximum is a paired implementation difference, not a graph-scaling law.</w:t>
       </w:r>
     </w:p>
     <w:p>
@@ -5464,7 +5469,7 @@
     </w:p>
     <w:p>
       <w:r>
-        <w:t>The final routed runtime bitstream targets xcku115-flva1517-2-i and has SHA-256 581354A62C8C7AEB134F300E7EA1928D8B681B996807710C61E307B33530D8F8. At 200 MHz it passed routed setup (+0.012 ns), hold (+0.010 ns), routing (zero unrouted nets), and DRC (zero errors). Its resource use is shown in Table 3. The physical link negotiated 100 Mbps during these uploads, although the interface is Gigabit-capable; no throughput or transfer-time distribution was measured.</w:t>
+        <w:t>The final routed runtime bitstream targets xcku115-flva1517-2-i and has SHA-256 581354A62C8C7AEB134F300E7EA1928D8B681B996807710C61E307B33530D8F8. At 200 MHz it passed routed setup (+0.012 ns), hold (+0.010 ns), routing (zero unrouted nets), and DRC (zero errors). Its resource use is shown in Table 3. The initial September 28 uploads negotiated 100 Mbps and did not record host-inclusive timing. During the separate September 30 P0 campaign a read-only host-adapter query reported a 1-Gbps negotiated link; the measured uploader durations below do not establish line-rate throughput or continuous link-speed monitoring.</w:t>
       </w:r>
     </w:p>
     <w:p>
@@ -5474,7 +5479,7 @@
     </w:p>
     <w:p>
       <w:r>
-        <w:t>After the courtship load, JTAG readback reported active neuron and edge counts 6,279 and 350,185, image status 1, checksum 45AEAAAE, epoch 2, and zero missed steps. In the eight-step smoke8 board trial, all eight per-step spike counts and the complete 2,475-event ordered raster matched the fixed-point CPU reference. The maximum core step took 199,699 cycles (998.495 µs), leaving 301 cycles (1.505 µs) against the 1-ms deadline; no summary fault flags were set. This is an exact short functional check on the newly loaded image, not a rerun of the 13 long courtship conditions or the 250-step visual trial.</w:t>
+        <w:t>After the initial courtship load, JTAG readback reported active neuron and edge counts 6,279 and 350,185, image status 1, checksum 45AEAAAE, epoch 2, and zero missed steps. In the eight-step smoke8 board trial, all eight per-step spike counts and the complete 2,475-event ordered raster matched the fixed-point CPU reference. The maximum core step took 199,699 cycles (998.495 µs), leaving 301 cycles (1.505 µs) against the 1-ms deadline; no summary fault flags were set. This September 28 result was a short functional check; the distinct September 30 P0 trials below expand its scope.</w:t>
       </w:r>
     </w:p>
     <w:p>
@@ -5523,7 +5528,1783 @@
         <w:pStyle w:val="PaperCaption"/>
       </w:pPr>
       <w:r>
-        <w:t>Figure 7. Two different graph images were committed and status-checked over UDP on one programmed AXKU115 bitstream (A). The courtship image was then executed for eight 1-ms steps; fixed-point CPU bars and FPGA diamond markers agree at every step, and all 2,475 ordered events agree (B). The visual graph was not given a new-bitstream execution trial. The upload link negotiated 100 Mbps in this experiment.</w:t>
+        <w:t>Figure 7. Initial September 28 graph replacement on one programmed AXKU115 bitstream (A). The courtship image was executed for eight 1-ms steps; fixed-point CPU bars and FPGA diamond markers agree at every step, and all 2,475 ordered events agree (B). The initial visual image was only committed and status-checked; subsequent full visual and long courtship trials are shown in Figure 8. The initial upload link negotiated 100 Mbps.</w:t>
+      </w:r>
+    </w:p>
+    <w:p>
+      <w:pPr>
+        <w:pStyle w:val="Heading2"/>
+      </w:pPr>
+      <w:r>
+        <w:t>Repeated full-trial and fault-recovery validation on physical AXKU115</w:t>
+      </w:r>
+    </w:p>
+    <w:p>
+      <w:r>
+        <w:t>The September 30 P0 campaign independently programmed the same SHA-256-pinned Ethernet runtime bitstream once in each of two sessions. Within each session, visual and courtship image changes and the later recovery were data transfers, not FPGA programming operations. The visual image committed at epoch 1 (6C233D31), and a complete 250-step trial matched all 250 fixed-CPU step counts and 560 ordered events. Courtship then committed at epoch 2 (45AEAAAE); its eight-step trial matched all 2,475 ordered events. Both sessions recorded the same 4,548-cycle visual and 199,699-cycle courtship maximum core steps, with zero missed deadlines and fault flags. Recovery reloaded visual at epoch 3 and again matched 560 ordered events over 250 steps. The event-word files and every summary word in the corresponding trials were byte-identical between sessions.</w:t>
+      </w:r>
+    </w:p>
+    <w:p>
+      <w:r>
+        <w:t>Three 4,308-step courtship conditions (15, 35, and 65 ms IPI) were then run in each session without changing the bitstream or reloading the courtship image. The vPN1, pC1, pIP10, and pMP2 response-window totals matched the frozen fixed-point CPU for all six board trials (Table 6; Figure 8). At every step, eight parsed non-cycle fields—total, aPN1, vPN1, pC1, pIP10, pMP2, event count, and flags—also matched the earlier dedicated-board capture: 34,464 compared fields per trial. The complete 34,464-word summary files were byte-identical between P0 sessions for each IPI. Relative to the dedicated implementation, core cycle counts differed in 642, 721, and 701 steps for IPI 15, 35, and 65 ms, respectively, with a maximum absolute difference of 636 cycles. All three P0 trial types had a 199,699-cycle maximum and zero deadline misses, state saturation, accumulator saturation, or event overflow. Full individual-event rasters were not captured for these long trials; events=0 in their raw runner log means event capture was disabled, not that the network generated no spikes.</w:t>
+      </w:r>
+    </w:p>
+    <w:p>
+      <w:pPr>
+        <w:pStyle w:val="PaperCaption"/>
+        <w:keepNext/>
+      </w:pPr>
+      <w:r>
+        <w:t>Table 6. Response-window courtship counts in each fixed-CPU reference and both Ethernet FPGA sessions (all three values equal for every entry)</w:t>
+      </w:r>
+    </w:p>
+    <w:tbl>
+      <w:tblPr>
+        <w:tblStyle w:val="TableGrid"/>
+        <w:tblW w:type="auto" w:w="0"/>
+        <w:tblLayout w:type="fixed"/>
+        <w:tblLook w:firstColumn="1" w:firstRow="1" w:lastColumn="0" w:lastRow="0" w:noHBand="0" w:noVBand="1" w:val="04A0"/>
+      </w:tblPr>
+      <w:tblGrid>
+        <w:gridCol w:w="1632"/>
+        <w:gridCol w:w="1632"/>
+        <w:gridCol w:w="1632"/>
+        <w:gridCol w:w="1632"/>
+        <w:gridCol w:w="1632"/>
+        <w:gridCol w:w="1632"/>
+      </w:tblGrid>
+      <w:tr>
+        <w:trPr>
+          <w:tblHeader/>
+        </w:trPr>
+        <w:tc>
+          <w:tcPr>
+            <w:tcW w:type="dxa" w:w="1775"/>
+            <w:vAlign w:val="center"/>
+            <w:tcMar>
+              <w:top w:w="85" w:type="dxa"/>
+              <w:left w:w="110" w:type="dxa"/>
+              <w:bottom w:w="85" w:type="dxa"/>
+              <w:right w:w="110" w:type="dxa"/>
+            </w:tcMar>
+            <w:tcBorders>
+              <w:top w:val="single" w:sz="4" w:color="D9D9D9"/>
+              <w:left w:val="single" w:sz="4" w:color="D9D9D9"/>
+              <w:bottom w:val="single" w:sz="4" w:color="D9D9D9"/>
+              <w:right w:val="single" w:sz="4" w:color="D9D9D9"/>
+            </w:tcBorders>
+            <w:shd w:fill="DDE9EF"/>
+          </w:tcPr>
+          <w:p>
+            <w:pPr>
+              <w:keepNext/>
+              <w:spacing w:after="0"/>
+              <w:jc w:val="left"/>
+            </w:pPr>
+            <w:r>
+              <w:rPr>
+                <w:rFonts w:ascii="Aptos" w:hAnsi="Aptos"/>
+                <w:b/>
+                <w:sz w:val="16"/>
+              </w:rPr>
+              <w:t>IPI (ms)</w:t>
+            </w:r>
+          </w:p>
+        </w:tc>
+        <w:tc>
+          <w:tcPr>
+            <w:tcW w:type="dxa" w:w="1158"/>
+            <w:vAlign w:val="center"/>
+            <w:tcMar>
+              <w:top w:w="85" w:type="dxa"/>
+              <w:left w:w="110" w:type="dxa"/>
+              <w:bottom w:w="85" w:type="dxa"/>
+              <w:right w:w="110" w:type="dxa"/>
+            </w:tcMar>
+            <w:tcBorders>
+              <w:top w:val="single" w:sz="4" w:color="D9D9D9"/>
+              <w:left w:val="single" w:sz="4" w:color="D9D9D9"/>
+              <w:bottom w:val="single" w:sz="4" w:color="D9D9D9"/>
+              <w:right w:val="single" w:sz="4" w:color="D9D9D9"/>
+            </w:tcBorders>
+            <w:shd w:fill="DDE9EF"/>
+          </w:tcPr>
+          <w:p>
+            <w:pPr>
+              <w:keepNext/>
+              <w:spacing w:after="0"/>
+              <w:jc w:val="center"/>
+            </w:pPr>
+            <w:r>
+              <w:rPr>
+                <w:rFonts w:ascii="Aptos" w:hAnsi="Aptos"/>
+                <w:b/>
+                <w:sz w:val="16"/>
+              </w:rPr>
+              <w:t>vPN1</w:t>
+            </w:r>
+          </w:p>
+        </w:tc>
+        <w:tc>
+          <w:tcPr>
+            <w:tcW w:type="dxa" w:w="1389"/>
+            <w:vAlign w:val="center"/>
+            <w:tcMar>
+              <w:top w:w="85" w:type="dxa"/>
+              <w:left w:w="110" w:type="dxa"/>
+              <w:bottom w:w="85" w:type="dxa"/>
+              <w:right w:w="110" w:type="dxa"/>
+            </w:tcMar>
+            <w:tcBorders>
+              <w:top w:val="single" w:sz="4" w:color="D9D9D9"/>
+              <w:left w:val="single" w:sz="4" w:color="D9D9D9"/>
+              <w:bottom w:val="single" w:sz="4" w:color="D9D9D9"/>
+              <w:right w:val="single" w:sz="4" w:color="D9D9D9"/>
+            </w:tcBorders>
+            <w:shd w:fill="DDE9EF"/>
+          </w:tcPr>
+          <w:p>
+            <w:pPr>
+              <w:keepNext/>
+              <w:spacing w:after="0"/>
+              <w:jc w:val="center"/>
+            </w:pPr>
+            <w:r>
+              <w:rPr>
+                <w:rFonts w:ascii="Aptos" w:hAnsi="Aptos"/>
+                <w:b/>
+                <w:sz w:val="16"/>
+              </w:rPr>
+              <w:t>pC1</w:t>
+            </w:r>
+          </w:p>
+        </w:tc>
+        <w:tc>
+          <w:tcPr>
+            <w:tcW w:type="dxa" w:w="1852"/>
+            <w:vAlign w:val="center"/>
+            <w:tcMar>
+              <w:top w:w="85" w:type="dxa"/>
+              <w:left w:w="110" w:type="dxa"/>
+              <w:bottom w:w="85" w:type="dxa"/>
+              <w:right w:w="110" w:type="dxa"/>
+            </w:tcMar>
+            <w:tcBorders>
+              <w:top w:val="single" w:sz="4" w:color="D9D9D9"/>
+              <w:left w:val="single" w:sz="4" w:color="D9D9D9"/>
+              <w:bottom w:val="single" w:sz="4" w:color="D9D9D9"/>
+              <w:right w:val="single" w:sz="4" w:color="D9D9D9"/>
+            </w:tcBorders>
+            <w:shd w:fill="DDE9EF"/>
+          </w:tcPr>
+          <w:p>
+            <w:pPr>
+              <w:keepNext/>
+              <w:spacing w:after="0"/>
+              <w:jc w:val="center"/>
+            </w:pPr>
+            <w:r>
+              <w:rPr>
+                <w:rFonts w:ascii="Aptos" w:hAnsi="Aptos"/>
+                <w:b/>
+                <w:sz w:val="16"/>
+              </w:rPr>
+              <w:t>pIP10</w:t>
+            </w:r>
+          </w:p>
+        </w:tc>
+        <w:tc>
+          <w:tcPr>
+            <w:tcW w:type="dxa" w:w="2084"/>
+            <w:vAlign w:val="center"/>
+            <w:tcMar>
+              <w:top w:w="85" w:type="dxa"/>
+              <w:left w:w="110" w:type="dxa"/>
+              <w:bottom w:w="85" w:type="dxa"/>
+              <w:right w:w="110" w:type="dxa"/>
+            </w:tcMar>
+            <w:tcBorders>
+              <w:top w:val="single" w:sz="4" w:color="D9D9D9"/>
+              <w:left w:val="single" w:sz="4" w:color="D9D9D9"/>
+              <w:bottom w:val="single" w:sz="4" w:color="D9D9D9"/>
+              <w:right w:val="single" w:sz="4" w:color="D9D9D9"/>
+            </w:tcBorders>
+            <w:shd w:fill="DDE9EF"/>
+          </w:tcPr>
+          <w:p>
+            <w:pPr>
+              <w:keepNext/>
+              <w:spacing w:after="0"/>
+              <w:jc w:val="center"/>
+            </w:pPr>
+            <w:r>
+              <w:rPr>
+                <w:rFonts w:ascii="Aptos" w:hAnsi="Aptos"/>
+                <w:b/>
+                <w:sz w:val="16"/>
+              </w:rPr>
+              <w:t>pMP2</w:t>
+            </w:r>
+          </w:p>
+        </w:tc>
+        <w:tc>
+          <w:tcPr>
+            <w:tcW w:type="dxa" w:w="1389"/>
+            <w:vAlign w:val="center"/>
+            <w:tcMar>
+              <w:top w:w="85" w:type="dxa"/>
+              <w:left w:w="110" w:type="dxa"/>
+              <w:bottom w:w="85" w:type="dxa"/>
+              <w:right w:w="110" w:type="dxa"/>
+            </w:tcMar>
+            <w:tcBorders>
+              <w:top w:val="single" w:sz="4" w:color="D9D9D9"/>
+              <w:left w:val="single" w:sz="4" w:color="D9D9D9"/>
+              <w:bottom w:val="single" w:sz="4" w:color="D9D9D9"/>
+              <w:right w:val="single" w:sz="4" w:color="D9D9D9"/>
+            </w:tcBorders>
+            <w:shd w:fill="DDE9EF"/>
+          </w:tcPr>
+          <w:p>
+            <w:pPr>
+              <w:keepNext/>
+              <w:spacing w:after="0"/>
+              <w:jc w:val="center"/>
+            </w:pPr>
+            <w:r>
+              <w:rPr>
+                <w:rFonts w:ascii="Aptos" w:hAnsi="Aptos"/>
+                <w:b/>
+                <w:sz w:val="16"/>
+              </w:rPr>
+              <w:t>Steps/session</w:t>
+            </w:r>
+          </w:p>
+        </w:tc>
+      </w:tr>
+      <w:tr>
+        <w:tc>
+          <w:tcPr>
+            <w:tcW w:type="dxa" w:w="1775"/>
+            <w:vAlign w:val="center"/>
+            <w:tcMar>
+              <w:top w:w="85" w:type="dxa"/>
+              <w:left w:w="110" w:type="dxa"/>
+              <w:bottom w:w="85" w:type="dxa"/>
+              <w:right w:w="110" w:type="dxa"/>
+            </w:tcMar>
+            <w:tcBorders>
+              <w:top w:val="single" w:sz="4" w:color="D9D9D9"/>
+              <w:left w:val="single" w:sz="4" w:color="D9D9D9"/>
+              <w:bottom w:val="single" w:sz="4" w:color="D9D9D9"/>
+              <w:right w:val="single" w:sz="4" w:color="D9D9D9"/>
+            </w:tcBorders>
+          </w:tcPr>
+          <w:p>
+            <w:pPr>
+              <w:keepNext/>
+              <w:spacing w:after="0"/>
+              <w:jc w:val="left"/>
+            </w:pPr>
+            <w:r>
+              <w:rPr>
+                <w:rFonts w:ascii="Aptos" w:hAnsi="Aptos"/>
+                <w:b w:val="0"/>
+                <w:sz w:val="16"/>
+              </w:rPr>
+              <w:t>15</w:t>
+            </w:r>
+          </w:p>
+        </w:tc>
+        <w:tc>
+          <w:tcPr>
+            <w:tcW w:type="dxa" w:w="1158"/>
+            <w:vAlign w:val="center"/>
+            <w:tcMar>
+              <w:top w:w="85" w:type="dxa"/>
+              <w:left w:w="110" w:type="dxa"/>
+              <w:bottom w:w="85" w:type="dxa"/>
+              <w:right w:w="110" w:type="dxa"/>
+            </w:tcMar>
+            <w:tcBorders>
+              <w:top w:val="single" w:sz="4" w:color="D9D9D9"/>
+              <w:left w:val="single" w:sz="4" w:color="D9D9D9"/>
+              <w:bottom w:val="single" w:sz="4" w:color="D9D9D9"/>
+              <w:right w:val="single" w:sz="4" w:color="D9D9D9"/>
+            </w:tcBorders>
+          </w:tcPr>
+          <w:p>
+            <w:pPr>
+              <w:keepNext/>
+              <w:spacing w:after="0"/>
+              <w:jc w:val="center"/>
+            </w:pPr>
+            <w:r>
+              <w:rPr>
+                <w:rFonts w:ascii="Aptos" w:hAnsi="Aptos"/>
+                <w:b w:val="0"/>
+                <w:sz w:val="16"/>
+              </w:rPr>
+              <w:t>25</w:t>
+            </w:r>
+          </w:p>
+        </w:tc>
+        <w:tc>
+          <w:tcPr>
+            <w:tcW w:type="dxa" w:w="1389"/>
+            <w:vAlign w:val="center"/>
+            <w:tcMar>
+              <w:top w:w="85" w:type="dxa"/>
+              <w:left w:w="110" w:type="dxa"/>
+              <w:bottom w:w="85" w:type="dxa"/>
+              <w:right w:w="110" w:type="dxa"/>
+            </w:tcMar>
+            <w:tcBorders>
+              <w:top w:val="single" w:sz="4" w:color="D9D9D9"/>
+              <w:left w:val="single" w:sz="4" w:color="D9D9D9"/>
+              <w:bottom w:val="single" w:sz="4" w:color="D9D9D9"/>
+              <w:right w:val="single" w:sz="4" w:color="D9D9D9"/>
+            </w:tcBorders>
+          </w:tcPr>
+          <w:p>
+            <w:pPr>
+              <w:keepNext/>
+              <w:spacing w:after="0"/>
+              <w:jc w:val="center"/>
+            </w:pPr>
+            <w:r>
+              <w:rPr>
+                <w:rFonts w:ascii="Aptos" w:hAnsi="Aptos"/>
+                <w:b w:val="0"/>
+                <w:sz w:val="16"/>
+              </w:rPr>
+              <w:t>611</w:t>
+            </w:r>
+          </w:p>
+        </w:tc>
+        <w:tc>
+          <w:tcPr>
+            <w:tcW w:type="dxa" w:w="1852"/>
+            <w:vAlign w:val="center"/>
+            <w:tcMar>
+              <w:top w:w="85" w:type="dxa"/>
+              <w:left w:w="110" w:type="dxa"/>
+              <w:bottom w:w="85" w:type="dxa"/>
+              <w:right w:w="110" w:type="dxa"/>
+            </w:tcMar>
+            <w:tcBorders>
+              <w:top w:val="single" w:sz="4" w:color="D9D9D9"/>
+              <w:left w:val="single" w:sz="4" w:color="D9D9D9"/>
+              <w:bottom w:val="single" w:sz="4" w:color="D9D9D9"/>
+              <w:right w:val="single" w:sz="4" w:color="D9D9D9"/>
+            </w:tcBorders>
+          </w:tcPr>
+          <w:p>
+            <w:pPr>
+              <w:keepNext/>
+              <w:spacing w:after="0"/>
+              <w:jc w:val="center"/>
+            </w:pPr>
+            <w:r>
+              <w:rPr>
+                <w:rFonts w:ascii="Aptos" w:hAnsi="Aptos"/>
+                <w:b w:val="0"/>
+                <w:sz w:val="16"/>
+              </w:rPr>
+              <w:t>36</w:t>
+            </w:r>
+          </w:p>
+        </w:tc>
+        <w:tc>
+          <w:tcPr>
+            <w:tcW w:type="dxa" w:w="2084"/>
+            <w:vAlign w:val="center"/>
+            <w:tcMar>
+              <w:top w:w="85" w:type="dxa"/>
+              <w:left w:w="110" w:type="dxa"/>
+              <w:bottom w:w="85" w:type="dxa"/>
+              <w:right w:w="110" w:type="dxa"/>
+            </w:tcMar>
+            <w:tcBorders>
+              <w:top w:val="single" w:sz="4" w:color="D9D9D9"/>
+              <w:left w:val="single" w:sz="4" w:color="D9D9D9"/>
+              <w:bottom w:val="single" w:sz="4" w:color="D9D9D9"/>
+              <w:right w:val="single" w:sz="4" w:color="D9D9D9"/>
+            </w:tcBorders>
+          </w:tcPr>
+          <w:p>
+            <w:pPr>
+              <w:keepNext/>
+              <w:spacing w:after="0"/>
+              <w:jc w:val="center"/>
+            </w:pPr>
+            <w:r>
+              <w:rPr>
+                <w:rFonts w:ascii="Aptos" w:hAnsi="Aptos"/>
+                <w:b w:val="0"/>
+                <w:sz w:val="16"/>
+              </w:rPr>
+              <w:t>4</w:t>
+            </w:r>
+          </w:p>
+        </w:tc>
+        <w:tc>
+          <w:tcPr>
+            <w:tcW w:type="dxa" w:w="1389"/>
+            <w:vAlign w:val="center"/>
+            <w:tcMar>
+              <w:top w:w="85" w:type="dxa"/>
+              <w:left w:w="110" w:type="dxa"/>
+              <w:bottom w:w="85" w:type="dxa"/>
+              <w:right w:w="110" w:type="dxa"/>
+            </w:tcMar>
+            <w:tcBorders>
+              <w:top w:val="single" w:sz="4" w:color="D9D9D9"/>
+              <w:left w:val="single" w:sz="4" w:color="D9D9D9"/>
+              <w:bottom w:val="single" w:sz="4" w:color="D9D9D9"/>
+              <w:right w:val="single" w:sz="4" w:color="D9D9D9"/>
+            </w:tcBorders>
+          </w:tcPr>
+          <w:p>
+            <w:pPr>
+              <w:keepNext/>
+              <w:spacing w:after="0"/>
+              <w:jc w:val="center"/>
+            </w:pPr>
+            <w:r>
+              <w:rPr>
+                <w:rFonts w:ascii="Aptos" w:hAnsi="Aptos"/>
+                <w:b w:val="0"/>
+                <w:sz w:val="16"/>
+              </w:rPr>
+              <w:t>4,308</w:t>
+            </w:r>
+          </w:p>
+        </w:tc>
+      </w:tr>
+      <w:tr>
+        <w:tc>
+          <w:tcPr>
+            <w:tcW w:type="dxa" w:w="1775"/>
+            <w:vAlign w:val="center"/>
+            <w:tcMar>
+              <w:top w:w="85" w:type="dxa"/>
+              <w:left w:w="110" w:type="dxa"/>
+              <w:bottom w:w="85" w:type="dxa"/>
+              <w:right w:w="110" w:type="dxa"/>
+            </w:tcMar>
+            <w:tcBorders>
+              <w:top w:val="single" w:sz="4" w:color="D9D9D9"/>
+              <w:left w:val="single" w:sz="4" w:color="D9D9D9"/>
+              <w:bottom w:val="single" w:sz="4" w:color="D9D9D9"/>
+              <w:right w:val="single" w:sz="4" w:color="D9D9D9"/>
+            </w:tcBorders>
+            <w:shd w:fill="F5F8FA"/>
+          </w:tcPr>
+          <w:p>
+            <w:pPr>
+              <w:keepNext/>
+              <w:spacing w:after="0"/>
+              <w:jc w:val="left"/>
+            </w:pPr>
+            <w:r>
+              <w:rPr>
+                <w:rFonts w:ascii="Aptos" w:hAnsi="Aptos"/>
+                <w:b w:val="0"/>
+                <w:sz w:val="16"/>
+              </w:rPr>
+              <w:t>35</w:t>
+            </w:r>
+          </w:p>
+        </w:tc>
+        <w:tc>
+          <w:tcPr>
+            <w:tcW w:type="dxa" w:w="1158"/>
+            <w:vAlign w:val="center"/>
+            <w:tcMar>
+              <w:top w:w="85" w:type="dxa"/>
+              <w:left w:w="110" w:type="dxa"/>
+              <w:bottom w:w="85" w:type="dxa"/>
+              <w:right w:w="110" w:type="dxa"/>
+            </w:tcMar>
+            <w:tcBorders>
+              <w:top w:val="single" w:sz="4" w:color="D9D9D9"/>
+              <w:left w:val="single" w:sz="4" w:color="D9D9D9"/>
+              <w:bottom w:val="single" w:sz="4" w:color="D9D9D9"/>
+              <w:right w:val="single" w:sz="4" w:color="D9D9D9"/>
+            </w:tcBorders>
+            <w:shd w:fill="F5F8FA"/>
+          </w:tcPr>
+          <w:p>
+            <w:pPr>
+              <w:keepNext/>
+              <w:spacing w:after="0"/>
+              <w:jc w:val="center"/>
+            </w:pPr>
+            <w:r>
+              <w:rPr>
+                <w:rFonts w:ascii="Aptos" w:hAnsi="Aptos"/>
+                <w:b w:val="0"/>
+                <w:sz w:val="16"/>
+              </w:rPr>
+              <w:t>222</w:t>
+            </w:r>
+          </w:p>
+        </w:tc>
+        <w:tc>
+          <w:tcPr>
+            <w:tcW w:type="dxa" w:w="1389"/>
+            <w:vAlign w:val="center"/>
+            <w:tcMar>
+              <w:top w:w="85" w:type="dxa"/>
+              <w:left w:w="110" w:type="dxa"/>
+              <w:bottom w:w="85" w:type="dxa"/>
+              <w:right w:w="110" w:type="dxa"/>
+            </w:tcMar>
+            <w:tcBorders>
+              <w:top w:val="single" w:sz="4" w:color="D9D9D9"/>
+              <w:left w:val="single" w:sz="4" w:color="D9D9D9"/>
+              <w:bottom w:val="single" w:sz="4" w:color="D9D9D9"/>
+              <w:right w:val="single" w:sz="4" w:color="D9D9D9"/>
+            </w:tcBorders>
+            <w:shd w:fill="F5F8FA"/>
+          </w:tcPr>
+          <w:p>
+            <w:pPr>
+              <w:keepNext/>
+              <w:spacing w:after="0"/>
+              <w:jc w:val="center"/>
+            </w:pPr>
+            <w:r>
+              <w:rPr>
+                <w:rFonts w:ascii="Aptos" w:hAnsi="Aptos"/>
+                <w:b w:val="0"/>
+                <w:sz w:val="16"/>
+              </w:rPr>
+              <w:t>1,735</w:t>
+            </w:r>
+          </w:p>
+        </w:tc>
+        <w:tc>
+          <w:tcPr>
+            <w:tcW w:type="dxa" w:w="1852"/>
+            <w:vAlign w:val="center"/>
+            <w:tcMar>
+              <w:top w:w="85" w:type="dxa"/>
+              <w:left w:w="110" w:type="dxa"/>
+              <w:bottom w:w="85" w:type="dxa"/>
+              <w:right w:w="110" w:type="dxa"/>
+            </w:tcMar>
+            <w:tcBorders>
+              <w:top w:val="single" w:sz="4" w:color="D9D9D9"/>
+              <w:left w:val="single" w:sz="4" w:color="D9D9D9"/>
+              <w:bottom w:val="single" w:sz="4" w:color="D9D9D9"/>
+              <w:right w:val="single" w:sz="4" w:color="D9D9D9"/>
+            </w:tcBorders>
+            <w:shd w:fill="F5F8FA"/>
+          </w:tcPr>
+          <w:p>
+            <w:pPr>
+              <w:keepNext/>
+              <w:spacing w:after="0"/>
+              <w:jc w:val="center"/>
+            </w:pPr>
+            <w:r>
+              <w:rPr>
+                <w:rFonts w:ascii="Aptos" w:hAnsi="Aptos"/>
+                <w:b w:val="0"/>
+                <w:sz w:val="16"/>
+              </w:rPr>
+              <w:t>109</w:t>
+            </w:r>
+          </w:p>
+        </w:tc>
+        <w:tc>
+          <w:tcPr>
+            <w:tcW w:type="dxa" w:w="2084"/>
+            <w:vAlign w:val="center"/>
+            <w:tcMar>
+              <w:top w:w="85" w:type="dxa"/>
+              <w:left w:w="110" w:type="dxa"/>
+              <w:bottom w:w="85" w:type="dxa"/>
+              <w:right w:w="110" w:type="dxa"/>
+            </w:tcMar>
+            <w:tcBorders>
+              <w:top w:val="single" w:sz="4" w:color="D9D9D9"/>
+              <w:left w:val="single" w:sz="4" w:color="D9D9D9"/>
+              <w:bottom w:val="single" w:sz="4" w:color="D9D9D9"/>
+              <w:right w:val="single" w:sz="4" w:color="D9D9D9"/>
+            </w:tcBorders>
+            <w:shd w:fill="F5F8FA"/>
+          </w:tcPr>
+          <w:p>
+            <w:pPr>
+              <w:keepNext/>
+              <w:spacing w:after="0"/>
+              <w:jc w:val="center"/>
+            </w:pPr>
+            <w:r>
+              <w:rPr>
+                <w:rFonts w:ascii="Aptos" w:hAnsi="Aptos"/>
+                <w:b w:val="0"/>
+                <w:sz w:val="16"/>
+              </w:rPr>
+              <w:t>9</w:t>
+            </w:r>
+          </w:p>
+        </w:tc>
+        <w:tc>
+          <w:tcPr>
+            <w:tcW w:type="dxa" w:w="1389"/>
+            <w:vAlign w:val="center"/>
+            <w:tcMar>
+              <w:top w:w="85" w:type="dxa"/>
+              <w:left w:w="110" w:type="dxa"/>
+              <w:bottom w:w="85" w:type="dxa"/>
+              <w:right w:w="110" w:type="dxa"/>
+            </w:tcMar>
+            <w:tcBorders>
+              <w:top w:val="single" w:sz="4" w:color="D9D9D9"/>
+              <w:left w:val="single" w:sz="4" w:color="D9D9D9"/>
+              <w:bottom w:val="single" w:sz="4" w:color="D9D9D9"/>
+              <w:right w:val="single" w:sz="4" w:color="D9D9D9"/>
+            </w:tcBorders>
+            <w:shd w:fill="F5F8FA"/>
+          </w:tcPr>
+          <w:p>
+            <w:pPr>
+              <w:keepNext/>
+              <w:spacing w:after="0"/>
+              <w:jc w:val="center"/>
+            </w:pPr>
+            <w:r>
+              <w:rPr>
+                <w:rFonts w:ascii="Aptos" w:hAnsi="Aptos"/>
+                <w:b w:val="0"/>
+                <w:sz w:val="16"/>
+              </w:rPr>
+              <w:t>4,308</w:t>
+            </w:r>
+          </w:p>
+        </w:tc>
+      </w:tr>
+      <w:tr>
+        <w:tc>
+          <w:tcPr>
+            <w:tcW w:type="dxa" w:w="1775"/>
+            <w:vAlign w:val="center"/>
+            <w:tcMar>
+              <w:top w:w="85" w:type="dxa"/>
+              <w:left w:w="110" w:type="dxa"/>
+              <w:bottom w:w="85" w:type="dxa"/>
+              <w:right w:w="110" w:type="dxa"/>
+            </w:tcMar>
+            <w:tcBorders>
+              <w:top w:val="single" w:sz="4" w:color="D9D9D9"/>
+              <w:left w:val="single" w:sz="4" w:color="D9D9D9"/>
+              <w:bottom w:val="single" w:sz="4" w:color="D9D9D9"/>
+              <w:right w:val="single" w:sz="4" w:color="D9D9D9"/>
+            </w:tcBorders>
+          </w:tcPr>
+          <w:p>
+            <w:pPr>
+              <w:keepNext w:val="0"/>
+              <w:spacing w:after="0"/>
+              <w:jc w:val="left"/>
+            </w:pPr>
+            <w:r>
+              <w:rPr>
+                <w:rFonts w:ascii="Aptos" w:hAnsi="Aptos"/>
+                <w:b w:val="0"/>
+                <w:sz w:val="16"/>
+              </w:rPr>
+              <w:t>65</w:t>
+            </w:r>
+          </w:p>
+        </w:tc>
+        <w:tc>
+          <w:tcPr>
+            <w:tcW w:type="dxa" w:w="1158"/>
+            <w:vAlign w:val="center"/>
+            <w:tcMar>
+              <w:top w:w="85" w:type="dxa"/>
+              <w:left w:w="110" w:type="dxa"/>
+              <w:bottom w:w="85" w:type="dxa"/>
+              <w:right w:w="110" w:type="dxa"/>
+            </w:tcMar>
+            <w:tcBorders>
+              <w:top w:val="single" w:sz="4" w:color="D9D9D9"/>
+              <w:left w:val="single" w:sz="4" w:color="D9D9D9"/>
+              <w:bottom w:val="single" w:sz="4" w:color="D9D9D9"/>
+              <w:right w:val="single" w:sz="4" w:color="D9D9D9"/>
+            </w:tcBorders>
+          </w:tcPr>
+          <w:p>
+            <w:pPr>
+              <w:keepNext w:val="0"/>
+              <w:spacing w:after="0"/>
+              <w:jc w:val="center"/>
+            </w:pPr>
+            <w:r>
+              <w:rPr>
+                <w:rFonts w:ascii="Aptos" w:hAnsi="Aptos"/>
+                <w:b w:val="0"/>
+                <w:sz w:val="16"/>
+              </w:rPr>
+              <w:t>244</w:t>
+            </w:r>
+          </w:p>
+        </w:tc>
+        <w:tc>
+          <w:tcPr>
+            <w:tcW w:type="dxa" w:w="1389"/>
+            <w:vAlign w:val="center"/>
+            <w:tcMar>
+              <w:top w:w="85" w:type="dxa"/>
+              <w:left w:w="110" w:type="dxa"/>
+              <w:bottom w:w="85" w:type="dxa"/>
+              <w:right w:w="110" w:type="dxa"/>
+            </w:tcMar>
+            <w:tcBorders>
+              <w:top w:val="single" w:sz="4" w:color="D9D9D9"/>
+              <w:left w:val="single" w:sz="4" w:color="D9D9D9"/>
+              <w:bottom w:val="single" w:sz="4" w:color="D9D9D9"/>
+              <w:right w:val="single" w:sz="4" w:color="D9D9D9"/>
+            </w:tcBorders>
+          </w:tcPr>
+          <w:p>
+            <w:pPr>
+              <w:keepNext w:val="0"/>
+              <w:spacing w:after="0"/>
+              <w:jc w:val="center"/>
+            </w:pPr>
+            <w:r>
+              <w:rPr>
+                <w:rFonts w:ascii="Aptos" w:hAnsi="Aptos"/>
+                <w:b w:val="0"/>
+                <w:sz w:val="16"/>
+              </w:rPr>
+              <w:t>2,326</w:t>
+            </w:r>
+          </w:p>
+        </w:tc>
+        <w:tc>
+          <w:tcPr>
+            <w:tcW w:type="dxa" w:w="1852"/>
+            <w:vAlign w:val="center"/>
+            <w:tcMar>
+              <w:top w:w="85" w:type="dxa"/>
+              <w:left w:w="110" w:type="dxa"/>
+              <w:bottom w:w="85" w:type="dxa"/>
+              <w:right w:w="110" w:type="dxa"/>
+            </w:tcMar>
+            <w:tcBorders>
+              <w:top w:val="single" w:sz="4" w:color="D9D9D9"/>
+              <w:left w:val="single" w:sz="4" w:color="D9D9D9"/>
+              <w:bottom w:val="single" w:sz="4" w:color="D9D9D9"/>
+              <w:right w:val="single" w:sz="4" w:color="D9D9D9"/>
+            </w:tcBorders>
+          </w:tcPr>
+          <w:p>
+            <w:pPr>
+              <w:keepNext w:val="0"/>
+              <w:spacing w:after="0"/>
+              <w:jc w:val="center"/>
+            </w:pPr>
+            <w:r>
+              <w:rPr>
+                <w:rFonts w:ascii="Aptos" w:hAnsi="Aptos"/>
+                <w:b w:val="0"/>
+                <w:sz w:val="16"/>
+              </w:rPr>
+              <w:t>83</w:t>
+            </w:r>
+          </w:p>
+        </w:tc>
+        <w:tc>
+          <w:tcPr>
+            <w:tcW w:type="dxa" w:w="2084"/>
+            <w:vAlign w:val="center"/>
+            <w:tcMar>
+              <w:top w:w="85" w:type="dxa"/>
+              <w:left w:w="110" w:type="dxa"/>
+              <w:bottom w:w="85" w:type="dxa"/>
+              <w:right w:w="110" w:type="dxa"/>
+            </w:tcMar>
+            <w:tcBorders>
+              <w:top w:val="single" w:sz="4" w:color="D9D9D9"/>
+              <w:left w:val="single" w:sz="4" w:color="D9D9D9"/>
+              <w:bottom w:val="single" w:sz="4" w:color="D9D9D9"/>
+              <w:right w:val="single" w:sz="4" w:color="D9D9D9"/>
+            </w:tcBorders>
+          </w:tcPr>
+          <w:p>
+            <w:pPr>
+              <w:keepNext w:val="0"/>
+              <w:spacing w:after="0"/>
+              <w:jc w:val="center"/>
+            </w:pPr>
+            <w:r>
+              <w:rPr>
+                <w:rFonts w:ascii="Aptos" w:hAnsi="Aptos"/>
+                <w:b w:val="0"/>
+                <w:sz w:val="16"/>
+              </w:rPr>
+              <w:t>57</w:t>
+            </w:r>
+          </w:p>
+        </w:tc>
+        <w:tc>
+          <w:tcPr>
+            <w:tcW w:type="dxa" w:w="1389"/>
+            <w:vAlign w:val="center"/>
+            <w:tcMar>
+              <w:top w:w="85" w:type="dxa"/>
+              <w:left w:w="110" w:type="dxa"/>
+              <w:bottom w:w="85" w:type="dxa"/>
+              <w:right w:w="110" w:type="dxa"/>
+            </w:tcMar>
+            <w:tcBorders>
+              <w:top w:val="single" w:sz="4" w:color="D9D9D9"/>
+              <w:left w:val="single" w:sz="4" w:color="D9D9D9"/>
+              <w:bottom w:val="single" w:sz="4" w:color="D9D9D9"/>
+              <w:right w:val="single" w:sz="4" w:color="D9D9D9"/>
+            </w:tcBorders>
+          </w:tcPr>
+          <w:p>
+            <w:pPr>
+              <w:keepNext w:val="0"/>
+              <w:spacing w:after="0"/>
+              <w:jc w:val="center"/>
+            </w:pPr>
+            <w:r>
+              <w:rPr>
+                <w:rFonts w:ascii="Aptos" w:hAnsi="Aptos"/>
+                <w:b w:val="0"/>
+                <w:sz w:val="16"/>
+              </w:rPr>
+              <w:t>4,308</w:t>
+            </w:r>
+          </w:p>
+        </w:tc>
+      </w:tr>
+    </w:tbl>
+    <w:p>
+      <w:pPr>
+        <w:spacing w:after="40"/>
+      </w:pPr>
+    </w:p>
+    <w:p>
+      <w:r>
+        <w:t>In each session, a deliberately interrupted partial UDP upload left the image loader incomplete; COMMIT rejected it with image status 0x16. An invalid postsynaptic index was separately rejected with status 0x66. After these negative tests, a valid visual reload restored image status 1 and the full visual trial passed. The companion JTAG runtime bitstream (SHA-256 95F9B50EE03804DDC211828A9FBD3B3171B45BC3FFB79F9F3B2407F0D3190E52) was programmed once, then accepted visual and courtship images with 560 and 2,475 matching ordered events. Its interrupted load, incomplete COMMIT, invalid postsynaptic index, and valid visual recovery passed separately; the final JTAG recovery reached epoch 4. These tests establish bounded protocol rejection and recovery for the injected faults, not exhaustive fault tolerance.</w:t>
+      </w:r>
+    </w:p>
+    <w:p>
+      <w:r>
+        <w:t>Host-inclusive UDP uploader times were 0.173 and 0.135 s for the 4,816-word visual image, and 1.360 and 1.848 s for the 738,044-word courtship image in sessions 1 and 2, respectively. These are two descriptive observations, not a throughput distribution or a pure wire-speed measurement; they exclude FPGA programming and neural trial/JTAG readback time. The different link-speed observations for the earlier and P0 runs are reported separately rather than pooled.</w:t>
+      </w:r>
+    </w:p>
+    <w:p>
+      <w:pPr>
+        <w:keepNext/>
+        <w:spacing w:after="60"/>
+        <w:jc w:val="center"/>
+      </w:pPr>
+      <w:r>
+        <w:drawing>
+          <wp:inline xmlns:a="http://schemas.openxmlformats.org/drawingml/2006/main" xmlns:pic="http://schemas.openxmlformats.org/drawingml/2006/picture">
+            <wp:extent cx="5989320" cy="4142613"/>
+            <wp:docPr id="7" name="Picture 7" descr="Two independent AXKU115 sessions show exact visual event output, three long courtship population responses equal to fixed CPU, and host-inclusive upload times"/>
+            <wp:cNvGraphicFramePr>
+              <a:graphicFrameLocks noChangeAspect="1"/>
+            </wp:cNvGraphicFramePr>
+            <a:graphic>
+              <a:graphicData uri="http://schemas.openxmlformats.org/drawingml/2006/picture">
+                <pic:pic>
+                  <pic:nvPicPr>
+                    <pic:cNvPr id="0" name="figure8_p0_repeated_board_validation.png"/>
+                    <pic:cNvPicPr/>
+                  </pic:nvPicPr>
+                  <pic:blipFill>
+                    <a:blip r:embed="rId15"/>
+                    <a:stretch>
+                      <a:fillRect/>
+                    </a:stretch>
+                  </pic:blipFill>
+                  <pic:spPr>
+                    <a:xfrm>
+                      <a:off x="0" y="0"/>
+                      <a:ext cx="5989320" cy="4142613"/>
+                    </a:xfrm>
+                    <a:prstGeom prst="rect"/>
+                  </pic:spPr>
+                </pic:pic>
+              </a:graphicData>
+            </a:graphic>
+          </wp:inline>
+        </w:drawing>
+      </w:r>
+    </w:p>
+    <w:p>
+      <w:pPr>
+        <w:pStyle w:val="PaperCaption"/>
+      </w:pPr>
+      <w:r>
+        <w:t>Figure 8. P0 validation in two independently programmed sessions using the same Ethernet runtime bitstream. (A) Complete visual CPU trace; sampled markers distinguish the two board sessions, which matched all 250 step counts and 560 ordered events each. (B) Host-inclusive visual and courtship UDP upload elapsed times. (C) Four courtship response-window population counts under three 4,308-step IPI conditions; bars are fixed CPU, circle/cross overlays are board sessions 1/2. Each group uses its own vertical scale. The long-trial evidence is group-count and per-step-summary agreement, not full individual-event agreement.</w:t>
+      </w:r>
+    </w:p>
+    <w:p>
+      <w:pPr>
+        <w:pStyle w:val="Heading2"/>
+      </w:pPr>
+      <w:r>
+        <w:t>Expanded-event bitstream and complete long-trial identity</w:t>
+      </w:r>
+    </w:p>
+    <w:p>
+      <w:r>
+        <w:t>The 65,536-entry event store in the original runtime image could accommodate the 40,868 events of the 15-ms IPI trial but not the 74,765 and 99,349 events of the 35- and 65-ms trials. We first enabled full event capture on the original image for the 15-ms condition: all 40,868 ordered events matched an independent fixed-point CPU reference and all 4,308 per-step total, group, and synapse-operation values matched the earlier dedicated-board capture. We then doubled the RTL event store to 131,072 entries without changing the graph image, neuron arithmetic, stimulus, or 200-MHz clock. The resulting Ethernet runtime bitstream has SHA-256 D4C9378D461147062FA5DC590CB3647D241C789B01CC6255F38DA16CB21990DF. Its routed implementation used 618/2,160 BRAM36 tiles, 26 more than the original Ethernet runtime's 592, and passed setup (+0.008 ns), hold (+0.030 ns), routing, and DRC signoff.</w:t>
+      </w:r>
+    </w:p>
+    <w:p>
+      <w:r>
+        <w:t>The first programming of this expanded-event bitstream showed a 1-Gbps physical link but no UDP ACK; JTAG diagnostics recorded 547 bad-FCS frames and no valid received frames. A temporary static ARP neighbor did not restore a STATUS reply. Reprogramming the same bitstream once restored UDP STATUS and enabled a successful 738,044-word courtship-image COMMIT (45AEAAAE). The three long tests below then ran without further FPGA programming or image replacement. This is one successful expanded-event board campaign after one failed first-program Ethernet attempt; it does not establish power-on reliability or a repeatable upload-time distribution.</w:t>
+      </w:r>
+    </w:p>
+    <w:p>
+      <w:r>
+        <w:t>All three 4,308-step trials matched the fixed-point CPU's complete ordered (timestep, neuron ID) sequence with zero event mismatches (Table 7; Figure 9). The 15-ms event-word and raw summary files were byte-identical between the original and expanded runtime captures. For all three conditions, 30,156 per-step total, group, and synapse-operation fields also matched the earlier dedicated-board capture; event-start offsets were contiguous, each captured event count equaled that step's total spikes, and no overflow, diagnostic fault, or missed deadline occurred. Each trial's maximum core latency was 199,699/200,000 cycles. Full event parity is now established for these three selected long stimuli on one board and one successful expanded-event programming state; it does not imply internal-state readback or agreement with biological recordings.</w:t>
+      </w:r>
+    </w:p>
+    <w:p>
+      <w:pPr>
+        <w:pStyle w:val="PaperCaption"/>
+        <w:keepNext/>
+      </w:pPr>
+      <w:r>
+        <w:t>Table 7. Complete long-trial ordered-event validation on the expanded-event Ethernet runtime bitstream</w:t>
+      </w:r>
+    </w:p>
+    <w:tbl>
+      <w:tblPr>
+        <w:tblStyle w:val="TableGrid"/>
+        <w:tblW w:type="auto" w:w="0"/>
+        <w:tblLayout w:type="fixed"/>
+        <w:tblLook w:firstColumn="1" w:firstRow="1" w:lastColumn="0" w:lastRow="0" w:noHBand="0" w:noVBand="1" w:val="04A0"/>
+      </w:tblPr>
+      <w:tblGrid>
+        <w:gridCol w:w="1958"/>
+        <w:gridCol w:w="1958"/>
+        <w:gridCol w:w="1958"/>
+        <w:gridCol w:w="1958"/>
+        <w:gridCol w:w="1958"/>
+      </w:tblGrid>
+      <w:tr>
+        <w:trPr>
+          <w:tblHeader/>
+        </w:trPr>
+        <w:tc>
+          <w:tcPr>
+            <w:tcW w:type="dxa" w:w="1914"/>
+            <w:vAlign w:val="center"/>
+            <w:tcMar>
+              <w:top w:w="85" w:type="dxa"/>
+              <w:left w:w="110" w:type="dxa"/>
+              <w:bottom w:w="85" w:type="dxa"/>
+              <w:right w:w="110" w:type="dxa"/>
+            </w:tcMar>
+            <w:tcBorders>
+              <w:top w:val="single" w:sz="4" w:color="D9D9D9"/>
+              <w:left w:val="single" w:sz="4" w:color="D9D9D9"/>
+              <w:bottom w:val="single" w:sz="4" w:color="D9D9D9"/>
+              <w:right w:val="single" w:sz="4" w:color="D9D9D9"/>
+            </w:tcBorders>
+            <w:shd w:fill="DDE9EF"/>
+          </w:tcPr>
+          <w:p>
+            <w:pPr>
+              <w:keepNext/>
+              <w:spacing w:after="0"/>
+              <w:jc w:val="left"/>
+            </w:pPr>
+            <w:r>
+              <w:rPr>
+                <w:rFonts w:ascii="Aptos" w:hAnsi="Aptos"/>
+                <w:b/>
+                <w:sz w:val="16"/>
+              </w:rPr>
+              <w:t>IPI (ms)</w:t>
+            </w:r>
+          </w:p>
+        </w:tc>
+        <w:tc>
+          <w:tcPr>
+            <w:tcW w:type="dxa" w:w="1674"/>
+            <w:vAlign w:val="center"/>
+            <w:tcMar>
+              <w:top w:w="85" w:type="dxa"/>
+              <w:left w:w="110" w:type="dxa"/>
+              <w:bottom w:w="85" w:type="dxa"/>
+              <w:right w:w="110" w:type="dxa"/>
+            </w:tcMar>
+            <w:tcBorders>
+              <w:top w:val="single" w:sz="4" w:color="D9D9D9"/>
+              <w:left w:val="single" w:sz="4" w:color="D9D9D9"/>
+              <w:bottom w:val="single" w:sz="4" w:color="D9D9D9"/>
+              <w:right w:val="single" w:sz="4" w:color="D9D9D9"/>
+            </w:tcBorders>
+            <w:shd w:fill="DDE9EF"/>
+          </w:tcPr>
+          <w:p>
+            <w:pPr>
+              <w:keepNext/>
+              <w:spacing w:after="0"/>
+              <w:jc w:val="center"/>
+            </w:pPr>
+            <w:r>
+              <w:rPr>
+                <w:rFonts w:ascii="Aptos" w:hAnsi="Aptos"/>
+                <w:b/>
+                <w:sz w:val="16"/>
+              </w:rPr>
+              <w:t>Steps</w:t>
+            </w:r>
+          </w:p>
+        </w:tc>
+        <w:tc>
+          <w:tcPr>
+            <w:tcW w:type="dxa" w:w="1674"/>
+            <w:vAlign w:val="center"/>
+            <w:tcMar>
+              <w:top w:w="85" w:type="dxa"/>
+              <w:left w:w="110" w:type="dxa"/>
+              <w:bottom w:w="85" w:type="dxa"/>
+              <w:right w:w="110" w:type="dxa"/>
+            </w:tcMar>
+            <w:tcBorders>
+              <w:top w:val="single" w:sz="4" w:color="D9D9D9"/>
+              <w:left w:val="single" w:sz="4" w:color="D9D9D9"/>
+              <w:bottom w:val="single" w:sz="4" w:color="D9D9D9"/>
+              <w:right w:val="single" w:sz="4" w:color="D9D9D9"/>
+            </w:tcBorders>
+            <w:shd w:fill="DDE9EF"/>
+          </w:tcPr>
+          <w:p>
+            <w:pPr>
+              <w:keepNext/>
+              <w:spacing w:after="0"/>
+              <w:jc w:val="center"/>
+            </w:pPr>
+            <w:r>
+              <w:rPr>
+                <w:rFonts w:ascii="Aptos" w:hAnsi="Aptos"/>
+                <w:b/>
+                <w:sz w:val="16"/>
+              </w:rPr>
+              <w:t>Ordered events CPU = FPGA</w:t>
+            </w:r>
+          </w:p>
+        </w:tc>
+        <w:tc>
+          <w:tcPr>
+            <w:tcW w:type="dxa" w:w="1674"/>
+            <w:vAlign w:val="center"/>
+            <w:tcMar>
+              <w:top w:w="85" w:type="dxa"/>
+              <w:left w:w="110" w:type="dxa"/>
+              <w:bottom w:w="85" w:type="dxa"/>
+              <w:right w:w="110" w:type="dxa"/>
+            </w:tcMar>
+            <w:tcBorders>
+              <w:top w:val="single" w:sz="4" w:color="D9D9D9"/>
+              <w:left w:val="single" w:sz="4" w:color="D9D9D9"/>
+              <w:bottom w:val="single" w:sz="4" w:color="D9D9D9"/>
+              <w:right w:val="single" w:sz="4" w:color="D9D9D9"/>
+            </w:tcBorders>
+            <w:shd w:fill="DDE9EF"/>
+          </w:tcPr>
+          <w:p>
+            <w:pPr>
+              <w:keepNext/>
+              <w:spacing w:after="0"/>
+              <w:jc w:val="center"/>
+            </w:pPr>
+            <w:r>
+              <w:rPr>
+                <w:rFonts w:ascii="Aptos" w:hAnsi="Aptos"/>
+                <w:b/>
+                <w:sz w:val="16"/>
+              </w:rPr>
+              <w:t>Event mismatches</w:t>
+            </w:r>
+          </w:p>
+        </w:tc>
+        <w:tc>
+          <w:tcPr>
+            <w:tcW w:type="dxa" w:w="2711"/>
+            <w:vAlign w:val="center"/>
+            <w:tcMar>
+              <w:top w:w="85" w:type="dxa"/>
+              <w:left w:w="110" w:type="dxa"/>
+              <w:bottom w:w="85" w:type="dxa"/>
+              <w:right w:w="110" w:type="dxa"/>
+            </w:tcMar>
+            <w:tcBorders>
+              <w:top w:val="single" w:sz="4" w:color="D9D9D9"/>
+              <w:left w:val="single" w:sz="4" w:color="D9D9D9"/>
+              <w:bottom w:val="single" w:sz="4" w:color="D9D9D9"/>
+              <w:right w:val="single" w:sz="4" w:color="D9D9D9"/>
+            </w:tcBorders>
+            <w:shd w:fill="DDE9EF"/>
+          </w:tcPr>
+          <w:p>
+            <w:pPr>
+              <w:keepNext/>
+              <w:spacing w:after="0"/>
+              <w:jc w:val="center"/>
+            </w:pPr>
+            <w:r>
+              <w:rPr>
+                <w:rFonts w:ascii="Aptos" w:hAnsi="Aptos"/>
+                <w:b/>
+                <w:sz w:val="16"/>
+              </w:rPr>
+              <w:t>Overflow or missed steps</w:t>
+            </w:r>
+          </w:p>
+        </w:tc>
+      </w:tr>
+      <w:tr>
+        <w:tc>
+          <w:tcPr>
+            <w:tcW w:type="dxa" w:w="1914"/>
+            <w:vAlign w:val="center"/>
+            <w:tcMar>
+              <w:top w:w="85" w:type="dxa"/>
+              <w:left w:w="110" w:type="dxa"/>
+              <w:bottom w:w="85" w:type="dxa"/>
+              <w:right w:w="110" w:type="dxa"/>
+            </w:tcMar>
+            <w:tcBorders>
+              <w:top w:val="single" w:sz="4" w:color="D9D9D9"/>
+              <w:left w:val="single" w:sz="4" w:color="D9D9D9"/>
+              <w:bottom w:val="single" w:sz="4" w:color="D9D9D9"/>
+              <w:right w:val="single" w:sz="4" w:color="D9D9D9"/>
+            </w:tcBorders>
+          </w:tcPr>
+          <w:p>
+            <w:pPr>
+              <w:keepNext/>
+              <w:spacing w:after="0"/>
+              <w:jc w:val="left"/>
+            </w:pPr>
+            <w:r>
+              <w:rPr>
+                <w:rFonts w:ascii="Aptos" w:hAnsi="Aptos"/>
+                <w:b w:val="0"/>
+                <w:sz w:val="16"/>
+              </w:rPr>
+              <w:t>15</w:t>
+            </w:r>
+          </w:p>
+        </w:tc>
+        <w:tc>
+          <w:tcPr>
+            <w:tcW w:type="dxa" w:w="1674"/>
+            <w:vAlign w:val="center"/>
+            <w:tcMar>
+              <w:top w:w="85" w:type="dxa"/>
+              <w:left w:w="110" w:type="dxa"/>
+              <w:bottom w:w="85" w:type="dxa"/>
+              <w:right w:w="110" w:type="dxa"/>
+            </w:tcMar>
+            <w:tcBorders>
+              <w:top w:val="single" w:sz="4" w:color="D9D9D9"/>
+              <w:left w:val="single" w:sz="4" w:color="D9D9D9"/>
+              <w:bottom w:val="single" w:sz="4" w:color="D9D9D9"/>
+              <w:right w:val="single" w:sz="4" w:color="D9D9D9"/>
+            </w:tcBorders>
+          </w:tcPr>
+          <w:p>
+            <w:pPr>
+              <w:keepNext/>
+              <w:spacing w:after="0"/>
+              <w:jc w:val="center"/>
+            </w:pPr>
+            <w:r>
+              <w:rPr>
+                <w:rFonts w:ascii="Aptos" w:hAnsi="Aptos"/>
+                <w:b w:val="0"/>
+                <w:sz w:val="16"/>
+              </w:rPr>
+              <w:t>4,308</w:t>
+            </w:r>
+          </w:p>
+        </w:tc>
+        <w:tc>
+          <w:tcPr>
+            <w:tcW w:type="dxa" w:w="1674"/>
+            <w:vAlign w:val="center"/>
+            <w:tcMar>
+              <w:top w:w="85" w:type="dxa"/>
+              <w:left w:w="110" w:type="dxa"/>
+              <w:bottom w:w="85" w:type="dxa"/>
+              <w:right w:w="110" w:type="dxa"/>
+            </w:tcMar>
+            <w:tcBorders>
+              <w:top w:val="single" w:sz="4" w:color="D9D9D9"/>
+              <w:left w:val="single" w:sz="4" w:color="D9D9D9"/>
+              <w:bottom w:val="single" w:sz="4" w:color="D9D9D9"/>
+              <w:right w:val="single" w:sz="4" w:color="D9D9D9"/>
+            </w:tcBorders>
+          </w:tcPr>
+          <w:p>
+            <w:pPr>
+              <w:keepNext/>
+              <w:spacing w:after="0"/>
+              <w:jc w:val="center"/>
+            </w:pPr>
+            <w:r>
+              <w:rPr>
+                <w:rFonts w:ascii="Aptos" w:hAnsi="Aptos"/>
+                <w:b w:val="0"/>
+                <w:sz w:val="16"/>
+              </w:rPr>
+              <w:t>40,868</w:t>
+            </w:r>
+          </w:p>
+        </w:tc>
+        <w:tc>
+          <w:tcPr>
+            <w:tcW w:type="dxa" w:w="1674"/>
+            <w:vAlign w:val="center"/>
+            <w:tcMar>
+              <w:top w:w="85" w:type="dxa"/>
+              <w:left w:w="110" w:type="dxa"/>
+              <w:bottom w:w="85" w:type="dxa"/>
+              <w:right w:w="110" w:type="dxa"/>
+            </w:tcMar>
+            <w:tcBorders>
+              <w:top w:val="single" w:sz="4" w:color="D9D9D9"/>
+              <w:left w:val="single" w:sz="4" w:color="D9D9D9"/>
+              <w:bottom w:val="single" w:sz="4" w:color="D9D9D9"/>
+              <w:right w:val="single" w:sz="4" w:color="D9D9D9"/>
+            </w:tcBorders>
+          </w:tcPr>
+          <w:p>
+            <w:pPr>
+              <w:keepNext/>
+              <w:spacing w:after="0"/>
+              <w:jc w:val="center"/>
+            </w:pPr>
+            <w:r>
+              <w:rPr>
+                <w:rFonts w:ascii="Aptos" w:hAnsi="Aptos"/>
+                <w:b w:val="0"/>
+                <w:sz w:val="16"/>
+              </w:rPr>
+              <w:t>0</w:t>
+            </w:r>
+          </w:p>
+        </w:tc>
+        <w:tc>
+          <w:tcPr>
+            <w:tcW w:type="dxa" w:w="2711"/>
+            <w:vAlign w:val="center"/>
+            <w:tcMar>
+              <w:top w:w="85" w:type="dxa"/>
+              <w:left w:w="110" w:type="dxa"/>
+              <w:bottom w:w="85" w:type="dxa"/>
+              <w:right w:w="110" w:type="dxa"/>
+            </w:tcMar>
+            <w:tcBorders>
+              <w:top w:val="single" w:sz="4" w:color="D9D9D9"/>
+              <w:left w:val="single" w:sz="4" w:color="D9D9D9"/>
+              <w:bottom w:val="single" w:sz="4" w:color="D9D9D9"/>
+              <w:right w:val="single" w:sz="4" w:color="D9D9D9"/>
+            </w:tcBorders>
+          </w:tcPr>
+          <w:p>
+            <w:pPr>
+              <w:keepNext/>
+              <w:spacing w:after="0"/>
+              <w:jc w:val="center"/>
+            </w:pPr>
+            <w:r>
+              <w:rPr>
+                <w:rFonts w:ascii="Aptos" w:hAnsi="Aptos"/>
+                <w:b w:val="0"/>
+                <w:sz w:val="16"/>
+              </w:rPr>
+              <w:t>0</w:t>
+            </w:r>
+          </w:p>
+        </w:tc>
+      </w:tr>
+      <w:tr>
+        <w:tc>
+          <w:tcPr>
+            <w:tcW w:type="dxa" w:w="1914"/>
+            <w:vAlign w:val="center"/>
+            <w:tcMar>
+              <w:top w:w="85" w:type="dxa"/>
+              <w:left w:w="110" w:type="dxa"/>
+              <w:bottom w:w="85" w:type="dxa"/>
+              <w:right w:w="110" w:type="dxa"/>
+            </w:tcMar>
+            <w:tcBorders>
+              <w:top w:val="single" w:sz="4" w:color="D9D9D9"/>
+              <w:left w:val="single" w:sz="4" w:color="D9D9D9"/>
+              <w:bottom w:val="single" w:sz="4" w:color="D9D9D9"/>
+              <w:right w:val="single" w:sz="4" w:color="D9D9D9"/>
+            </w:tcBorders>
+            <w:shd w:fill="F5F8FA"/>
+          </w:tcPr>
+          <w:p>
+            <w:pPr>
+              <w:keepNext/>
+              <w:spacing w:after="0"/>
+              <w:jc w:val="left"/>
+            </w:pPr>
+            <w:r>
+              <w:rPr>
+                <w:rFonts w:ascii="Aptos" w:hAnsi="Aptos"/>
+                <w:b w:val="0"/>
+                <w:sz w:val="16"/>
+              </w:rPr>
+              <w:t>35</w:t>
+            </w:r>
+          </w:p>
+        </w:tc>
+        <w:tc>
+          <w:tcPr>
+            <w:tcW w:type="dxa" w:w="1674"/>
+            <w:vAlign w:val="center"/>
+            <w:tcMar>
+              <w:top w:w="85" w:type="dxa"/>
+              <w:left w:w="110" w:type="dxa"/>
+              <w:bottom w:w="85" w:type="dxa"/>
+              <w:right w:w="110" w:type="dxa"/>
+            </w:tcMar>
+            <w:tcBorders>
+              <w:top w:val="single" w:sz="4" w:color="D9D9D9"/>
+              <w:left w:val="single" w:sz="4" w:color="D9D9D9"/>
+              <w:bottom w:val="single" w:sz="4" w:color="D9D9D9"/>
+              <w:right w:val="single" w:sz="4" w:color="D9D9D9"/>
+            </w:tcBorders>
+            <w:shd w:fill="F5F8FA"/>
+          </w:tcPr>
+          <w:p>
+            <w:pPr>
+              <w:keepNext/>
+              <w:spacing w:after="0"/>
+              <w:jc w:val="center"/>
+            </w:pPr>
+            <w:r>
+              <w:rPr>
+                <w:rFonts w:ascii="Aptos" w:hAnsi="Aptos"/>
+                <w:b w:val="0"/>
+                <w:sz w:val="16"/>
+              </w:rPr>
+              <w:t>4,308</w:t>
+            </w:r>
+          </w:p>
+        </w:tc>
+        <w:tc>
+          <w:tcPr>
+            <w:tcW w:type="dxa" w:w="1674"/>
+            <w:vAlign w:val="center"/>
+            <w:tcMar>
+              <w:top w:w="85" w:type="dxa"/>
+              <w:left w:w="110" w:type="dxa"/>
+              <w:bottom w:w="85" w:type="dxa"/>
+              <w:right w:w="110" w:type="dxa"/>
+            </w:tcMar>
+            <w:tcBorders>
+              <w:top w:val="single" w:sz="4" w:color="D9D9D9"/>
+              <w:left w:val="single" w:sz="4" w:color="D9D9D9"/>
+              <w:bottom w:val="single" w:sz="4" w:color="D9D9D9"/>
+              <w:right w:val="single" w:sz="4" w:color="D9D9D9"/>
+            </w:tcBorders>
+            <w:shd w:fill="F5F8FA"/>
+          </w:tcPr>
+          <w:p>
+            <w:pPr>
+              <w:keepNext/>
+              <w:spacing w:after="0"/>
+              <w:jc w:val="center"/>
+            </w:pPr>
+            <w:r>
+              <w:rPr>
+                <w:rFonts w:ascii="Aptos" w:hAnsi="Aptos"/>
+                <w:b w:val="0"/>
+                <w:sz w:val="16"/>
+              </w:rPr>
+              <w:t>74,765</w:t>
+            </w:r>
+          </w:p>
+        </w:tc>
+        <w:tc>
+          <w:tcPr>
+            <w:tcW w:type="dxa" w:w="1674"/>
+            <w:vAlign w:val="center"/>
+            <w:tcMar>
+              <w:top w:w="85" w:type="dxa"/>
+              <w:left w:w="110" w:type="dxa"/>
+              <w:bottom w:w="85" w:type="dxa"/>
+              <w:right w:w="110" w:type="dxa"/>
+            </w:tcMar>
+            <w:tcBorders>
+              <w:top w:val="single" w:sz="4" w:color="D9D9D9"/>
+              <w:left w:val="single" w:sz="4" w:color="D9D9D9"/>
+              <w:bottom w:val="single" w:sz="4" w:color="D9D9D9"/>
+              <w:right w:val="single" w:sz="4" w:color="D9D9D9"/>
+            </w:tcBorders>
+            <w:shd w:fill="F5F8FA"/>
+          </w:tcPr>
+          <w:p>
+            <w:pPr>
+              <w:keepNext/>
+              <w:spacing w:after="0"/>
+              <w:jc w:val="center"/>
+            </w:pPr>
+            <w:r>
+              <w:rPr>
+                <w:rFonts w:ascii="Aptos" w:hAnsi="Aptos"/>
+                <w:b w:val="0"/>
+                <w:sz w:val="16"/>
+              </w:rPr>
+              <w:t>0</w:t>
+            </w:r>
+          </w:p>
+        </w:tc>
+        <w:tc>
+          <w:tcPr>
+            <w:tcW w:type="dxa" w:w="2711"/>
+            <w:vAlign w:val="center"/>
+            <w:tcMar>
+              <w:top w:w="85" w:type="dxa"/>
+              <w:left w:w="110" w:type="dxa"/>
+              <w:bottom w:w="85" w:type="dxa"/>
+              <w:right w:w="110" w:type="dxa"/>
+            </w:tcMar>
+            <w:tcBorders>
+              <w:top w:val="single" w:sz="4" w:color="D9D9D9"/>
+              <w:left w:val="single" w:sz="4" w:color="D9D9D9"/>
+              <w:bottom w:val="single" w:sz="4" w:color="D9D9D9"/>
+              <w:right w:val="single" w:sz="4" w:color="D9D9D9"/>
+            </w:tcBorders>
+            <w:shd w:fill="F5F8FA"/>
+          </w:tcPr>
+          <w:p>
+            <w:pPr>
+              <w:keepNext/>
+              <w:spacing w:after="0"/>
+              <w:jc w:val="center"/>
+            </w:pPr>
+            <w:r>
+              <w:rPr>
+                <w:rFonts w:ascii="Aptos" w:hAnsi="Aptos"/>
+                <w:b w:val="0"/>
+                <w:sz w:val="16"/>
+              </w:rPr>
+              <w:t>0</w:t>
+            </w:r>
+          </w:p>
+        </w:tc>
+      </w:tr>
+      <w:tr>
+        <w:tc>
+          <w:tcPr>
+            <w:tcW w:type="dxa" w:w="1914"/>
+            <w:vAlign w:val="center"/>
+            <w:tcMar>
+              <w:top w:w="85" w:type="dxa"/>
+              <w:left w:w="110" w:type="dxa"/>
+              <w:bottom w:w="85" w:type="dxa"/>
+              <w:right w:w="110" w:type="dxa"/>
+            </w:tcMar>
+            <w:tcBorders>
+              <w:top w:val="single" w:sz="4" w:color="D9D9D9"/>
+              <w:left w:val="single" w:sz="4" w:color="D9D9D9"/>
+              <w:bottom w:val="single" w:sz="4" w:color="D9D9D9"/>
+              <w:right w:val="single" w:sz="4" w:color="D9D9D9"/>
+            </w:tcBorders>
+          </w:tcPr>
+          <w:p>
+            <w:pPr>
+              <w:keepNext w:val="0"/>
+              <w:spacing w:after="0"/>
+              <w:jc w:val="left"/>
+            </w:pPr>
+            <w:r>
+              <w:rPr>
+                <w:rFonts w:ascii="Aptos" w:hAnsi="Aptos"/>
+                <w:b w:val="0"/>
+                <w:sz w:val="16"/>
+              </w:rPr>
+              <w:t>65</w:t>
+            </w:r>
+          </w:p>
+        </w:tc>
+        <w:tc>
+          <w:tcPr>
+            <w:tcW w:type="dxa" w:w="1674"/>
+            <w:vAlign w:val="center"/>
+            <w:tcMar>
+              <w:top w:w="85" w:type="dxa"/>
+              <w:left w:w="110" w:type="dxa"/>
+              <w:bottom w:w="85" w:type="dxa"/>
+              <w:right w:w="110" w:type="dxa"/>
+            </w:tcMar>
+            <w:tcBorders>
+              <w:top w:val="single" w:sz="4" w:color="D9D9D9"/>
+              <w:left w:val="single" w:sz="4" w:color="D9D9D9"/>
+              <w:bottom w:val="single" w:sz="4" w:color="D9D9D9"/>
+              <w:right w:val="single" w:sz="4" w:color="D9D9D9"/>
+            </w:tcBorders>
+          </w:tcPr>
+          <w:p>
+            <w:pPr>
+              <w:keepNext w:val="0"/>
+              <w:spacing w:after="0"/>
+              <w:jc w:val="center"/>
+            </w:pPr>
+            <w:r>
+              <w:rPr>
+                <w:rFonts w:ascii="Aptos" w:hAnsi="Aptos"/>
+                <w:b w:val="0"/>
+                <w:sz w:val="16"/>
+              </w:rPr>
+              <w:t>4,308</w:t>
+            </w:r>
+          </w:p>
+        </w:tc>
+        <w:tc>
+          <w:tcPr>
+            <w:tcW w:type="dxa" w:w="1674"/>
+            <w:vAlign w:val="center"/>
+            <w:tcMar>
+              <w:top w:w="85" w:type="dxa"/>
+              <w:left w:w="110" w:type="dxa"/>
+              <w:bottom w:w="85" w:type="dxa"/>
+              <w:right w:w="110" w:type="dxa"/>
+            </w:tcMar>
+            <w:tcBorders>
+              <w:top w:val="single" w:sz="4" w:color="D9D9D9"/>
+              <w:left w:val="single" w:sz="4" w:color="D9D9D9"/>
+              <w:bottom w:val="single" w:sz="4" w:color="D9D9D9"/>
+              <w:right w:val="single" w:sz="4" w:color="D9D9D9"/>
+            </w:tcBorders>
+          </w:tcPr>
+          <w:p>
+            <w:pPr>
+              <w:keepNext w:val="0"/>
+              <w:spacing w:after="0"/>
+              <w:jc w:val="center"/>
+            </w:pPr>
+            <w:r>
+              <w:rPr>
+                <w:rFonts w:ascii="Aptos" w:hAnsi="Aptos"/>
+                <w:b w:val="0"/>
+                <w:sz w:val="16"/>
+              </w:rPr>
+              <w:t>99,349</w:t>
+            </w:r>
+          </w:p>
+        </w:tc>
+        <w:tc>
+          <w:tcPr>
+            <w:tcW w:type="dxa" w:w="1674"/>
+            <w:vAlign w:val="center"/>
+            <w:tcMar>
+              <w:top w:w="85" w:type="dxa"/>
+              <w:left w:w="110" w:type="dxa"/>
+              <w:bottom w:w="85" w:type="dxa"/>
+              <w:right w:w="110" w:type="dxa"/>
+            </w:tcMar>
+            <w:tcBorders>
+              <w:top w:val="single" w:sz="4" w:color="D9D9D9"/>
+              <w:left w:val="single" w:sz="4" w:color="D9D9D9"/>
+              <w:bottom w:val="single" w:sz="4" w:color="D9D9D9"/>
+              <w:right w:val="single" w:sz="4" w:color="D9D9D9"/>
+            </w:tcBorders>
+          </w:tcPr>
+          <w:p>
+            <w:pPr>
+              <w:keepNext w:val="0"/>
+              <w:spacing w:after="0"/>
+              <w:jc w:val="center"/>
+            </w:pPr>
+            <w:r>
+              <w:rPr>
+                <w:rFonts w:ascii="Aptos" w:hAnsi="Aptos"/>
+                <w:b w:val="0"/>
+                <w:sz w:val="16"/>
+              </w:rPr>
+              <w:t>0</w:t>
+            </w:r>
+          </w:p>
+        </w:tc>
+        <w:tc>
+          <w:tcPr>
+            <w:tcW w:type="dxa" w:w="2711"/>
+            <w:vAlign w:val="center"/>
+            <w:tcMar>
+              <w:top w:w="85" w:type="dxa"/>
+              <w:left w:w="110" w:type="dxa"/>
+              <w:bottom w:w="85" w:type="dxa"/>
+              <w:right w:w="110" w:type="dxa"/>
+            </w:tcMar>
+            <w:tcBorders>
+              <w:top w:val="single" w:sz="4" w:color="D9D9D9"/>
+              <w:left w:val="single" w:sz="4" w:color="D9D9D9"/>
+              <w:bottom w:val="single" w:sz="4" w:color="D9D9D9"/>
+              <w:right w:val="single" w:sz="4" w:color="D9D9D9"/>
+            </w:tcBorders>
+          </w:tcPr>
+          <w:p>
+            <w:pPr>
+              <w:keepNext w:val="0"/>
+              <w:spacing w:after="0"/>
+              <w:jc w:val="center"/>
+            </w:pPr>
+            <w:r>
+              <w:rPr>
+                <w:rFonts w:ascii="Aptos" w:hAnsi="Aptos"/>
+                <w:b w:val="0"/>
+                <w:sz w:val="16"/>
+              </w:rPr>
+              <w:t>0</w:t>
+            </w:r>
+          </w:p>
+        </w:tc>
+      </w:tr>
+    </w:tbl>
+    <w:p>
+      <w:pPr>
+        <w:spacing w:after="40"/>
+      </w:pPr>
+    </w:p>
+    <w:p>
+      <w:pPr>
+        <w:keepNext/>
+        <w:spacing w:after="60"/>
+        <w:jc w:val="center"/>
+      </w:pPr>
+      <w:r>
+        <w:drawing>
+          <wp:inline xmlns:a="http://schemas.openxmlformats.org/drawingml/2006/main" xmlns:pic="http://schemas.openxmlformats.org/drawingml/2006/picture">
+            <wp:extent cx="5989320" cy="4192524"/>
+            <wp:docPr id="8" name="Picture 8" descr="Three binned courtship event rasters and cumulative event traces; all 214982 raw ordered board events matched fixed CPU, with two trials exceeding the old 65536-event buffer"/>
+            <wp:cNvGraphicFramePr>
+              <a:graphicFrameLocks noChangeAspect="1"/>
+            </wp:cNvGraphicFramePr>
+            <a:graphic>
+              <a:graphicData uri="http://schemas.openxmlformats.org/drawingml/2006/picture">
+                <pic:pic>
+                  <pic:nvPicPr>
+                    <pic:cNvPr id="0" name="figure9_long_ordered_events.png"/>
+                    <pic:cNvPicPr/>
+                  </pic:nvPicPr>
+                  <pic:blipFill>
+                    <a:blip r:embed="rId16"/>
+                    <a:stretch>
+                      <a:fillRect/>
+                    </a:stretch>
+                  </pic:blipFill>
+                  <pic:spPr>
+                    <a:xfrm>
+                      <a:off x="0" y="0"/>
+                      <a:ext cx="5989320" cy="4192524"/>
+                    </a:xfrm>
+                    <a:prstGeom prst="rect"/>
+                  </pic:spPr>
+                </pic:pic>
+              </a:graphicData>
+            </a:graphic>
+          </wp:inline>
+        </w:drawing>
+      </w:r>
+    </w:p>
+    <w:p>
+      <w:pPr>
+        <w:pStyle w:val="PaperCaption"/>
+      </w:pPr>
+      <w:r>
+        <w:t>Figure 9. Three complete 4,308-step courtship trials on the expanded-event runtime image. Left: binned neuron-by-time event raster for display only. Right: cumulative raw event counts; the dashed line marks the prior 65,536-event BRAM limit crossed by the 35- and 65-ms trials. The audit compares all 214,982 raw ordered events without binning against independently generated fixed-point CPU references and reports zero mismatches, overflows, or missed steps. This is one successful board campaign, not a second independent-board replication.</w:t>
+      </w:r>
+    </w:p>
+    <w:p>
+      <w:pPr>
+        <w:pStyle w:val="Heading2"/>
+      </w:pPr>
+      <w:r>
+        <w:t>Speed controlled validation of the expanded event image</w:t>
+      </w:r>
+    </w:p>
+    <w:p>
+      <w:r>
+        <w:t>On October 1, the same expanded-event bitstream was programmed once with a measured 100 Mbps full-duplex link. All 20/20 repeated read-only STATUS probes replied on their first attempt. The complete courtship graph uploaded as 738,044 words in 11,538 protocol packets and committed with checksum 45AEAAAE; a subsequent correctly sequenced STATUS confirmed image readiness. The eight-step courtship trial matched all eight fixed-CPU spike counts and all 2,475 ordered events at epoch 1, with a maximum core latency of 199,699 cycles and zero missed steps or fault flags (Figure 10). The post-trial MAC bad-FCS count was zero. The host's original IP and NIC speed setting were restored afterwards. This is one additional passing 100-Mbps programming session, not a repeated cold-start test or a rerun of the three long conditions at a controlled 100-Mbps rate.</w:t>
+      </w:r>
+    </w:p>
+    <w:p>
+      <w:r>
+        <w:t>The prior first-program failure was followed by two failed JTAG configurations and one failed configuration after a user-reported full power cycle. In these three later sessions the MAC indicated 1 Gbps, reported 365, 370, and 354 bad-FCS frames, respectively, and no valid receive frames. These were separate probes, not a random sample from which to estimate a failure probability. The original runtime had previously received valid frames with zero bad FCS while the host reported 1 Gbps. Thus gigabit operation is historically observed but its reliability is not established for the expanded image. The new 100-Mbps result narrows the problem to receive integrity under the failed conditions rather than locating its physical cause.</w:t>
+      </w:r>
+    </w:p>
+    <w:p>
+      <w:r>
+        <w:t>The PHY's RGMII pad-skew settings read as the documented defaults. At 1 Gbps its RX clock is 125 MHz, versus 25 MHz at 100 Mbps [5]. Both existing routed checkpoints met the modeled receive-input timing constraints; the expanded image's worst reported input hold slack was +0.668 ns. However, the fixed 400-tap IDELAYE3 COUNT setting is uncalibrated and has no voltage or temperature compensation [6], and static timing does not measure the PHY/PCB data eye. Separately, the host subsequently reported an actual 100-Mbps link despite a driver setting of 1 Gbps full duplex. Cable capability, connector/NIC/PHY behavior, and FPGA RGMII sampling remain candidate explanations. The cable has not been independently qualified for gigabit operation. Further 1-Gbps tests are deferred pending a controlled cable/link check; neither a cable fault nor a timing fix is claimed here.</w:t>
+      </w:r>
+    </w:p>
+    <w:p>
+      <w:pPr>
+        <w:keepNext/>
+        <w:spacing w:after="60"/>
+        <w:jc w:val="center"/>
+      </w:pPr>
+      <w:r>
+        <w:drawing>
+          <wp:inline xmlns:a="http://schemas.openxmlformats.org/drawingml/2006/main" xmlns:pic="http://schemas.openxmlformats.org/drawingml/2006/picture">
+            <wp:extent cx="5989320" cy="2291565"/>
+            <wp:docPr id="9" name="Picture 9" descr="Eight-step courtship counts coincide between fixed CPU and AXKU115 at a measured 100-Mbps link, and each core step meets the 200000-cycle deadline; all 2475 ordered events match and bad FCS is zero"/>
+            <wp:cNvGraphicFramePr>
+              <a:graphicFrameLocks noChangeAspect="1"/>
+            </wp:cNvGraphicFramePr>
+            <a:graphic>
+              <a:graphicData uri="http://schemas.openxmlformats.org/drawingml/2006/picture">
+                <pic:pic>
+                  <pic:nvPicPr>
+                    <pic:cNvPr id="0" name="figure10_100m_board_validation.png"/>
+                    <pic:cNvPicPr/>
+                  </pic:nvPicPr>
+                  <pic:blipFill>
+                    <a:blip r:embed="rId17"/>
+                    <a:stretch>
+                      <a:fillRect/>
+                    </a:stretch>
+                  </pic:blipFill>
+                  <pic:spPr>
+                    <a:xfrm>
+                      <a:off x="0" y="0"/>
+                      <a:ext cx="5989320" cy="2291565"/>
+                    </a:xfrm>
+                    <a:prstGeom prst="rect"/>
+                  </pic:spPr>
+                </pic:pic>
+              </a:graphicData>
+            </a:graphic>
+          </wp:inline>
+        </w:drawing>
+      </w:r>
+    </w:p>
+    <w:p>
+      <w:pPr>
+        <w:pStyle w:val="PaperCaption"/>
+      </w:pPr>
+      <w:r>
+        <w:t>Figure 10. Additional speed-controlled trial on the same expanded-event bitstream at an actual 100-Mbps link. (A) Fixed-CPU and board whole-network spike counts coincide at all eight steps; a separate raw-event audit matched all 2,475 ordered events. (B) Core step cycles remain below the 200,000-cycle deadline, with a 301-cycle minimum margin. The recorded session also passed 20/20 STATUS probes and a complete courtship UDP image upload, with zero post-trial bad FCS. These results describe one eight-step session and do not establish 1-Gbps reliability or long-trial performance at 100 Mbps.</w:t>
       </w:r>
     </w:p>
     <w:p>
@@ -7127,7 +8908,7 @@
         <w:drawing>
           <wp:inline xmlns:a="http://schemas.openxmlformats.org/drawingml/2006/main" xmlns:pic="http://schemas.openxmlformats.org/drawingml/2006/picture">
             <wp:extent cx="5989320" cy="2395727"/>
-            <wp:docPr id="7" name="Picture 7" descr="Left and right unilateral LC10a input produce ipsilateral DNa02 spikes in the extracted graph but none in the simplified graph"/>
+            <wp:docPr id="10" name="Picture 10" descr="Left and right unilateral LC10a input produce ipsilateral DNa02 spikes in the extracted graph but none in the simplified graph"/>
             <wp:cNvGraphicFramePr>
               <a:graphicFrameLocks noChangeAspect="1"/>
             </wp:cNvGraphicFramePr>
@@ -7139,7 +8920,7 @@
                     <pic:cNvPicPr/>
                   </pic:nvPicPr>
                   <pic:blipFill>
-                    <a:blip r:embed="rId15"/>
+                    <a:blip r:embed="rId18"/>
                     <a:stretch>
                       <a:fillRect/>
                     </a:stretch>
@@ -7181,7 +8962,7 @@
     </w:p>
     <w:p>
       <w:r>
-        <w:t>This study demonstrates a reproducible route from a pinned connectome release to a physical, time-multiplexed neural engine. Its principal deployment contribution is separation of FPGA hardware compilation from graph deployment: a single bitstream accepted two very different compiled network images through a network port without reprogramming. The paired short courtship test shows an important qualification: the observed neural events stayed identical while cycle counts, resources, and routed timing changed. The large courtship candidate fits and just meets a 1-ms model timestep at 200 MHz, leaving only 301 cycles in the new runtime smoke test; the older dedicated visual implementation had a much wider observed deadline margin under a different graph and stimulus. The layered comparisons make the scope of fidelity explicit. Float/fixed equality supports the selected numerical format over tested inputs; RTL equality supports internal update logic over eight visual steps; board equality supports the events and counters actually exported by each physical implementation. None compares the model with biological data.</w:t>
+        <w:t>This study demonstrates a reproducible route from a pinned connectome release to a physical, time-multiplexed neural engine. Its principal deployment contribution is separation of FPGA hardware compilation from graph deployment: the same bitstream accepted two very different compiled network images through a network port without reprogramming between images. Two independently programmed original-runtime sessions reproduce full visual output, three long courtship response conditions, and tested rejection/recovery paths, beyond the initial commit and smoke test. A separate JTAG runtime bitstream establishes the same two-image concept on the JTAG transport. The expanded-event runtime image adds complete ordered-event equality for three selected long courtship stimuli in one successful board campaign. The paired courtship comparison shows an important qualification: observed neural outputs stayed identical within the measured scopes while cycle counts, resources, and routed timing changed. The large courtship candidate fits and just meets a 1-ms model timestep at 200 MHz, leaving only 301 cycles in the runtime trials. The layered comparisons make fidelity scope explicit: float/fixed equality supports the selected numerical format over tested inputs; RTL equality supports internal update logic over eight visual steps; board equality supports only the events and counters actually exported. None compares the model with biological data.</w:t>
       </w:r>
     </w:p>
     <w:p>
@@ -7196,12 +8977,12 @@
     </w:p>
     <w:p>
       <w:r>
-        <w:t>The engineering limitations are also concrete. Long courtship board runs were compared at group-count resolution because complete event rasters exceeded capture capacity. The new Ethernet bitstream was exercised with only an eight-step courtship trial after two image uploads; its visual image was committed and status-checked but not run through a new-bitstream neural-output trial. The exact short-trial event agreement does not establish equality of internal neuron states or long-trial outputs between bitstreams; nor does the observed one-cycle-per-spike latency increment identify its RTL cause. Older dedicated/JTAG trials must not be pooled as repeat measurements of the new bitstream. Internal state equality was established in RTL simulation rather than read back from the chip. Random graph damage and weight jitter were not exercised on FPGA, and the earlier board noise trials share a scalar current perturbation across input cells. We measured neither FPGA board power nor host-transfer-inclusive throughput, and the measured upload link here was 100 Mbps. The near-deadline courtship timing and narrow routed setup margin leave limited room for increased graph size at the present clock and scheduler.</w:t>
+        <w:t>The engineering limitations are also concrete. The original P0 long trials had only group and per-step-summary readback; the expanded-event bitstream closes that observability gap for three selected stimuli but was tested in only one successful programming state, after a first-program UDP failure with bad-FCS frames. It does not establish power-on reliability, event identity for every stimulus in the suite, or internal neuron-state equality. The observed one-cycle-per-spike increment in the earlier eight-step comparison does not identify its RTL cause. The two P0 sessions used the same board, bitstream hash, stimulus files, and laboratory setup, not independent hardware or laboratories; the older dedicated/JTAG trials are paired comparators, not repeat measurements of the Ethernet bitstream. Internal state equality was established in RTL simulation rather than read back from the chip. Random graph damage and weight jitter were not exercised on FPGA, and earlier board noise trials share a scalar current perturbation across input cells. We measured no board power. Two host-inclusive UDP upload times per image are descriptive and cannot characterize sustained application throughput or line rate; the earlier run reported a 100-Mbps negotiated link, whereas a host query during P0 reported 1 Gbps. The near-deadline courtship timing and narrow routed setup margin (+0.008 ns in the expanded-event build) leave limited room for increased graph size at the present clock and scheduler.</w:t>
       </w:r>
     </w:p>
     <w:p>
       <w:r>
-        <w:t>The next biological experiment is to map specific experimental drivers and imaging regions to reconstructed MaleCNS cells, then define an observation model and held-out stimuli before adjusting the dynamics. The next engineering experiment is to run a full visual stimulus and multiple long courtship conditions on the Ethernet-loaded bitstream, test independently generated graph perturbations as new images, benchmark host-inclusive transfer under a verified Gigabit link, repeat board runs, and measure power externally. Such work would change the evidence base; it is not presumed by the present results.</w:t>
+        <w:t>The next biological experiment is to map specific experimental drivers and imaging regions to reconstructed MaleCNS cells, then define an observation model and held-out stimuli before adjusting the dynamics. Engineering follow-up should test independently generated graph perturbations as new images, reproduce the expanded-event image across cold boots and another board/laboratory, extend event capture to the remaining stimuli or add internal-state probes, measure sustained application throughput with repeated transfers and link monitoring, and measure board power externally. These are prospective tests, not results established here.</w:t>
       </w:r>
     </w:p>
     <w:p>
@@ -7214,7 +8995,12 @@
     </w:p>
     <w:p>
       <w:r>
-        <w:t>CNS2FPGA extracted two MaleCNS subgraphs and deployed both as data images onto one programmed 200-MHz AXKU115 without FPGA recompilation or reprogramming between images. The Ethernet-loaded courtship graph matched 2,475 ordered fixed-point CPU events in an eight-step trial and met the 1-ms deadline by 301 cycles. A paired comparison with the older dedicated courtship bitstream found exactly the same event file but a 636-cycle larger worst-case core step and a larger hardware footprint. Earlier dedicated implementations supplied wider courtship and visual functional comparisons, including 560 matched visual events; these are separate experiments. The evidence supports runtime connectome-to-hardware deployment and execution fidelity within recorded scopes, with measurable hardware cost. Biological plausibility remains conditional on cell mapping, stimulus encoding, and independent neural or behavioral observations.</w:t>
+        <w:t>CNS2FPGA extracted two MaleCNS subgraphs and deployed both as data images onto a 200-MHz AXKU115 without FPGA recompilation or reprogramming between images. Two independent original-runtime programming sessions reproduced the 250-step visual event sequence, the eight-step courtship event sequence, and fixed-CPU population responses in three 4,308-step courtship conditions, while tested malformed uploads were rejected and a valid image recovered operation. An expanded-event bitstream subsequently reproduced every one of 214,982 ordered events across those three long trials in one successful board campaign after a first-program Ethernet failure. The worst observed courtship core step remained 199,699 cycles, 301 below the 1-ms deadline. A paired comparison with the older dedicated courtship bitstream found the same exported neural outputs in tested cases but up to 636 more cycles per step and a larger hardware footprint. The evidence supports runtime connectome-to-hardware deployment and observable execution fidelity within recorded scopes; it does not yet establish biological plausibility, full internal-state identity on silicon, independent-board reproducibility, power-on Ethernet reliability, or energy efficiency.</w:t>
+      </w:r>
+    </w:p>
+    <w:p>
+      <w:r>
+        <w:t>The additional 100-Mbps session confirms complete graph loading and short-trial event fidelity with the expanded image at that measured link rate. Earlier 1-Gbps receive failures and the uncertain cable/link condition remain recorded; the present evidence does not establish reliable gigabit operation.</w:t>
       </w:r>
     </w:p>
     <w:p>
@@ -7227,7 +9013,7 @@
     </w:p>
     <w:p>
       <w:r>
-        <w:t>The paper package contains seven rendered figures in figures/, selected machine-readable result tables, Ethernet deployment evidence, and the paired old/new board comparison JSON in paper_data/, plus paper_data/manifest.json with SHA-256 values and paths to their source artifacts. The complete local source, configurations, intermediate graphs, CPU archives, memory images, raw FPGA captures, physical-design reports, and protocol locks remain in the numbered project directories under E:\Workspace\CNS2FPGA\code. The MaleCNS v1.0 source is pinned under support/ and is available from the official download site [2]; reuse must comply with the source license and attribution terms. No public repository DOI or independently reproduced hardware dataset is claimed. Figures are generated from the cited project result files rather than from fly experiments.</w:t>
+        <w:t>The paper package contains ten rendered figures in figures/, 36 data snapshots including result tables, the paired old/new board comparison, the independently audited P0 campaign JSON, expanded-event long-trial raw events and summaries, and the additional 100-Mbps trial audit/capture and receive-path diagnosis in paper_data/. The accompanying paper_data/manifest.json records SHA-256 values and source paths. Complete local sources, configurations, intermediate graphs, CPU archives, memory images, raw FPGA captures, physical-design reports, and protocol locks remain in the numbered project directories. The public repository additionally includes curated P0, long-event, and 100-Mbps captures and selected log excerpts. The MaleCNS v1.0 source is pinned under support/ and is available from the official download site [2]; reuse must comply with the source license and attribution terms. No public repository DOI or independent-board reproduction is claimed. Figures are generated from project result files rather than fly experiments.</w:t>
       </w:r>
     </w:p>
     <w:p>
@@ -7256,6 +9042,16 @@
     <w:p>
       <w:r>
         <w:t>4. Collie MF, Jin C, Rockwell V, Kellogg E, Vanderbeck QX, Hartman AK, Holtz SL, Wilson RI. Specialized parallel pathways for adaptive control of visual object pursuit. Neuron. 2026;114(10):1833–1847.e9. doi: 10.1016/j.neuron.2026.01.001 (https://doi.org/10.1016/j.neuron.2026.01.001).</w:t>
+      </w:r>
+    </w:p>
+    <w:p>
+      <w:r>
+        <w:t>5. Microchip Technology. KSZ9031RNX Gigabit Ethernet Transceiver with RGMII Support Data Sheet (https://ww1.microchip.com/downloads/aemDocuments/documents/UNG/ProductDocuments/DataSheets/KSZ9031RNX-Data-Sheet-DS00002117.pdf). DS00002117K. RGMII timing, pad-skew registers, and RXER counter. Accessed 1 October 2026.</w:t>
+      </w:r>
+    </w:p>
+    <w:p>
+      <w:r>
+        <w:t>6. AMD. UltraScale Architecture SelectIO Resources User Guide (https://docs.amd.com/api/khub/documents/kFbaUC5HGcXyGNauhgU6Gw/content). UG571 v1.16, 14 January 2025. IDELAYE3 COUNT and TIME modes. Accessed 1 October 2026.</w:t>
       </w:r>
     </w:p>
     <w:p>
@@ -8060,7 +9856,7 @@
           </w:tcPr>
           <w:p>
             <w:pPr>
-              <w:keepNext w:val="0"/>
+              <w:keepNext/>
               <w:spacing w:after="0"/>
               <w:jc w:val="left"/>
             </w:pPr>
@@ -8093,6 +9889,214 @@
           </w:tcPr>
           <w:p>
             <w:pPr>
+              <w:keepNext/>
+              <w:spacing w:after="0"/>
+              <w:jc w:val="center"/>
+            </w:pPr>
+            <w:r>
+              <w:rPr>
+                <w:rFonts w:ascii="Aptos" w:hAnsi="Aptos"/>
+                <w:b w:val="0"/>
+                <w:sz w:val="16"/>
+              </w:rPr>
+              <w:t>paper_data/old_new_board_comparison_v1.json</w:t>
+            </w:r>
+          </w:p>
+        </w:tc>
+      </w:tr>
+      <w:tr>
+        <w:tc>
+          <w:tcPr>
+            <w:tcW w:type="dxa" w:w="3168"/>
+            <w:vAlign w:val="center"/>
+            <w:tcMar>
+              <w:top w:w="85" w:type="dxa"/>
+              <w:left w:w="110" w:type="dxa"/>
+              <w:bottom w:w="85" w:type="dxa"/>
+              <w:right w:w="110" w:type="dxa"/>
+            </w:tcMar>
+            <w:tcBorders>
+              <w:top w:val="single" w:sz="4" w:color="D9D9D9"/>
+              <w:left w:val="single" w:sz="4" w:color="D9D9D9"/>
+              <w:bottom w:val="single" w:sz="4" w:color="D9D9D9"/>
+              <w:right w:val="single" w:sz="4" w:color="D9D9D9"/>
+            </w:tcBorders>
+            <w:shd w:fill="F5F8FA"/>
+          </w:tcPr>
+          <w:p>
+            <w:pPr>
+              <w:keepNext/>
+              <w:spacing w:after="0"/>
+              <w:jc w:val="left"/>
+            </w:pPr>
+            <w:r>
+              <w:rPr>
+                <w:rFonts w:ascii="Aptos" w:hAnsi="Aptos"/>
+                <w:b w:val="0"/>
+                <w:sz w:val="16"/>
+              </w:rPr>
+              <w:t>Table 6, Figure 8, repeated P0 and JTAG fault tests</w:t>
+            </w:r>
+          </w:p>
+        </w:tc>
+        <w:tc>
+          <w:tcPr>
+            <w:tcW w:type="dxa" w:w="6480"/>
+            <w:vAlign w:val="center"/>
+            <w:tcMar>
+              <w:top w:w="85" w:type="dxa"/>
+              <w:left w:w="110" w:type="dxa"/>
+              <w:bottom w:w="85" w:type="dxa"/>
+              <w:right w:w="110" w:type="dxa"/>
+            </w:tcMar>
+            <w:tcBorders>
+              <w:top w:val="single" w:sz="4" w:color="D9D9D9"/>
+              <w:left w:val="single" w:sz="4" w:color="D9D9D9"/>
+              <w:bottom w:val="single" w:sz="4" w:color="D9D9D9"/>
+              <w:right w:val="single" w:sz="4" w:color="D9D9D9"/>
+            </w:tcBorders>
+            <w:shd w:fill="F5F8FA"/>
+          </w:tcPr>
+          <w:p>
+            <w:pPr>
+              <w:keepNext/>
+              <w:spacing w:after="0"/>
+              <w:jc w:val="center"/>
+            </w:pPr>
+            <w:r>
+              <w:rPr>
+                <w:rFonts w:ascii="Aptos" w:hAnsi="Aptos"/>
+                <w:b w:val="0"/>
+                <w:sz w:val="16"/>
+              </w:rPr>
+              <w:t>paper_data/p0_board_audit_v1.json, paper_data/p0_host_link_observation_20260930.md</w:t>
+            </w:r>
+          </w:p>
+        </w:tc>
+      </w:tr>
+      <w:tr>
+        <w:tc>
+          <w:tcPr>
+            <w:tcW w:type="dxa" w:w="3168"/>
+            <w:vAlign w:val="center"/>
+            <w:tcMar>
+              <w:top w:w="85" w:type="dxa"/>
+              <w:left w:w="110" w:type="dxa"/>
+              <w:bottom w:w="85" w:type="dxa"/>
+              <w:right w:w="110" w:type="dxa"/>
+            </w:tcMar>
+            <w:tcBorders>
+              <w:top w:val="single" w:sz="4" w:color="D9D9D9"/>
+              <w:left w:val="single" w:sz="4" w:color="D9D9D9"/>
+              <w:bottom w:val="single" w:sz="4" w:color="D9D9D9"/>
+              <w:right w:val="single" w:sz="4" w:color="D9D9D9"/>
+            </w:tcBorders>
+          </w:tcPr>
+          <w:p>
+            <w:pPr>
+              <w:keepNext/>
+              <w:spacing w:after="0"/>
+              <w:jc w:val="left"/>
+            </w:pPr>
+            <w:r>
+              <w:rPr>
+                <w:rFonts w:ascii="Aptos" w:hAnsi="Aptos"/>
+                <w:b w:val="0"/>
+                <w:sz w:val="16"/>
+              </w:rPr>
+              <w:t>Table 7 and Figure 9, complete long ordered events</w:t>
+            </w:r>
+          </w:p>
+        </w:tc>
+        <w:tc>
+          <w:tcPr>
+            <w:tcW w:type="dxa" w:w="6480"/>
+            <w:vAlign w:val="center"/>
+            <w:tcMar>
+              <w:top w:w="85" w:type="dxa"/>
+              <w:left w:w="110" w:type="dxa"/>
+              <w:bottom w:w="85" w:type="dxa"/>
+              <w:right w:w="110" w:type="dxa"/>
+            </w:tcMar>
+            <w:tcBorders>
+              <w:top w:val="single" w:sz="4" w:color="D9D9D9"/>
+              <w:left w:val="single" w:sz="4" w:color="D9D9D9"/>
+              <w:bottom w:val="single" w:sz="4" w:color="D9D9D9"/>
+              <w:right w:val="single" w:sz="4" w:color="D9D9D9"/>
+            </w:tcBorders>
+          </w:tcPr>
+          <w:p>
+            <w:pPr>
+              <w:keepNext/>
+              <w:spacing w:after="0"/>
+              <w:jc w:val="center"/>
+            </w:pPr>
+            <w:r>
+              <w:rPr>
+                <w:rFonts w:ascii="Aptos" w:hAnsi="Aptos"/>
+                <w:b w:val="0"/>
+                <w:sz w:val="16"/>
+              </w:rPr>
+              <w:t>paper_data/long_event_board_audit_v1.json, paper_data/long_event_ipi_15_board_events.hex, paper_data/long_event_ipi_35_board_events.hex, paper_data/long_event_ipi_65_board_events.hex, corresponding CPU event CSV and board summary hex files</w:t>
+            </w:r>
+          </w:p>
+        </w:tc>
+      </w:tr>
+      <w:tr>
+        <w:tc>
+          <w:tcPr>
+            <w:tcW w:type="dxa" w:w="3168"/>
+            <w:vAlign w:val="center"/>
+            <w:tcMar>
+              <w:top w:w="85" w:type="dxa"/>
+              <w:left w:w="110" w:type="dxa"/>
+              <w:bottom w:w="85" w:type="dxa"/>
+              <w:right w:w="110" w:type="dxa"/>
+            </w:tcMar>
+            <w:tcBorders>
+              <w:top w:val="single" w:sz="4" w:color="D9D9D9"/>
+              <w:left w:val="single" w:sz="4" w:color="D9D9D9"/>
+              <w:bottom w:val="single" w:sz="4" w:color="D9D9D9"/>
+              <w:right w:val="single" w:sz="4" w:color="D9D9D9"/>
+            </w:tcBorders>
+            <w:shd w:fill="F5F8FA"/>
+          </w:tcPr>
+          <w:p>
+            <w:pPr>
+              <w:keepNext w:val="0"/>
+              <w:spacing w:after="0"/>
+              <w:jc w:val="left"/>
+            </w:pPr>
+            <w:r>
+              <w:rPr>
+                <w:rFonts w:ascii="Aptos" w:hAnsi="Aptos"/>
+                <w:b w:val="0"/>
+                <w:sz w:val="16"/>
+              </w:rPr>
+              <w:t>Figure 10, measured 100-Mbps trial and receive-path diagnosis</w:t>
+            </w:r>
+          </w:p>
+        </w:tc>
+        <w:tc>
+          <w:tcPr>
+            <w:tcW w:type="dxa" w:w="6480"/>
+            <w:vAlign w:val="center"/>
+            <w:tcMar>
+              <w:top w:w="85" w:type="dxa"/>
+              <w:left w:w="110" w:type="dxa"/>
+              <w:bottom w:w="85" w:type="dxa"/>
+              <w:right w:w="110" w:type="dxa"/>
+            </w:tcMar>
+            <w:tcBorders>
+              <w:top w:val="single" w:sz="4" w:color="D9D9D9"/>
+              <w:left w:val="single" w:sz="4" w:color="D9D9D9"/>
+              <w:bottom w:val="single" w:sz="4" w:color="D9D9D9"/>
+              <w:right w:val="single" w:sz="4" w:color="D9D9D9"/>
+            </w:tcBorders>
+            <w:shd w:fill="F5F8FA"/>
+          </w:tcPr>
+          <w:p>
+            <w:pPr>
               <w:keepNext w:val="0"/>
               <w:spacing w:after="0"/>
               <w:jc w:val="center"/>
@@ -8103,7 +10107,7 @@
                 <w:b w:val="0"/>
                 <w:sz w:val="16"/>
               </w:rPr>
-              <w:t>paper_data/old_new_board_comparison_v1.json</w:t>
+              <w:t>paper_data/expanded_bit_100m_audit_v1.json, paper_data/expanded_bit_100m_registers.csv, paper_data/expanded_bit_100m_summary_words.hex, paper_data/expanded_bit_100m_event_words.hex, paper_data/expanded_bit_100m_board_test_20261001.md, paper_data/ethernet_100m_vs_1g_diagnosis_20261001.md</w:t>
             </w:r>
           </w:p>
         </w:tc>

</xml_diff>